<commit_message>
Paper: the author's latest edits, with the coverage-fix numbers and 7.12 on top as tracked changes
Co-Authored-By: Claude Opus 5.5 <noreply@anthropic.com>
Claude-Session: https://claude.ai/code/session_01MMCRR3CeBf6AnYqivqwtdY
</commit_message>
<xml_diff>
--- a/designs/rd2/paper/RD24_paper.docx
+++ b/designs/rd2/paper/RD24_paper.docx
@@ -114,193 +114,163 @@
         <w:t>move an AI agent toward collusion</w:t>
       </w:r>
       <w:r>
+        <w:t xml:space="preserve"> in a simulated commodities market;</w:t>
+      </w:r>
+      <w:r>
+        <w:t xml:space="preserve"> whether </w:t>
+      </w:r>
+      <w:r>
+        <w:t>the framing of a</w:t>
+      </w:r>
+      <w:r>
+        <w:t xml:space="preserve"> counterparty</w:t>
+      </w:r>
+      <w:r>
+        <w:t xml:space="preserve">’s </w:t>
+      </w:r>
+      <w:r>
+        <w:t xml:space="preserve">requests </w:t>
+      </w:r>
+      <w:r>
+        <w:t>influence</w:t>
+      </w:r>
+      <w:r>
+        <w:t xml:space="preserve"> an agent’s long-run decision making</w:t>
+      </w:r>
+      <w:r>
         <w:t xml:space="preserve"> </w:t>
       </w:r>
       <w:r>
-        <w:t>in a simulated commodities market</w:t>
-      </w:r>
-      <w:r>
-        <w:t>;</w:t>
-      </w:r>
-      <w:r>
-        <w:t xml:space="preserve"> whether </w:t>
-      </w:r>
-      <w:r>
-        <w:t>the framing of a</w:t>
-      </w:r>
-      <w:r>
-        <w:t xml:space="preserve"> counterparty</w:t>
-      </w:r>
-      <w:r>
-        <w:t xml:space="preserve">’s </w:t>
-      </w:r>
-      <w:r>
-        <w:t xml:space="preserve">requests </w:t>
-      </w:r>
-      <w:r>
-        <w:t>influence</w:t>
-      </w:r>
-      <w:r>
-        <w:t xml:space="preserve"> an agent’s long-run decision making</w:t>
+        <w:t xml:space="preserve">or </w:t>
+      </w:r>
+      <w:r>
+        <w:t xml:space="preserve">even motivate it to </w:t>
+      </w:r>
+      <w:r>
+        <w:t xml:space="preserve">participate in </w:t>
+      </w:r>
+      <w:r>
+        <w:t xml:space="preserve">the </w:t>
+      </w:r>
+      <w:r>
+        <w:t>requested misconduct.</w:t>
       </w:r>
       <w:r>
         <w:t xml:space="preserve"> </w:t>
       </w:r>
       <w:r>
-        <w:t xml:space="preserve">or </w:t>
-      </w:r>
-      <w:r>
-        <w:t xml:space="preserve">even motivate it to </w:t>
-      </w:r>
-      <w:r>
-        <w:t xml:space="preserve">participate in </w:t>
-      </w:r>
-      <w:r>
-        <w:t xml:space="preserve">the </w:t>
-      </w:r>
-      <w:r>
-        <w:t>requested misconduct.</w:t>
+        <w:br/>
+      </w:r>
+      <w:r>
+        <w:br/>
+      </w:r>
+      <w:r>
+        <w:t>We place an open-weights model (Gemma 3 12B) in the seat of a bank’s silver trading desk</w:t>
+      </w:r>
+      <w:r>
+        <w:t xml:space="preserve"> in a simulation built</w:t>
+      </w:r>
+      <w:r>
+        <w:t xml:space="preserve"> from real </w:t>
+      </w:r>
+      <w:r>
+        <w:t>transcript</w:t>
       </w:r>
       <w:r>
         <w:t xml:space="preserve"> </w:t>
       </w:r>
       <w:r>
+        <w:t>of</w:t>
+      </w:r>
+      <w:r>
+        <w:t xml:space="preserve"> the London silver-fixing litigation. Each </w:t>
+      </w:r>
+      <w:r>
+        <w:t>“</w:t>
+      </w:r>
+      <w:r>
+        <w:t>career</w:t>
+      </w:r>
+      <w:r>
+        <w:t>”</w:t>
+      </w:r>
+      <w:r>
+        <w:t xml:space="preserve"> covers 34 chat days and </w:t>
+      </w:r>
+      <w:r>
+        <w:t>5</w:t>
+      </w:r>
+      <w:r>
+        <w:t xml:space="preserve"> trading days</w:t>
+      </w:r>
+      <w:r>
+        <w:t xml:space="preserve">, </w:t>
+      </w:r>
+      <w:r>
+        <w:t xml:space="preserve">replayed </w:t>
+      </w:r>
+      <w:r>
+        <w:t xml:space="preserve">on real </w:t>
+      </w:r>
+      <w:r>
+        <w:t xml:space="preserve">2011 </w:t>
+      </w:r>
+      <w:r>
+        <w:t xml:space="preserve">silver </w:t>
+      </w:r>
+      <w:r>
+        <w:t>price</w:t>
+      </w:r>
+      <w:r>
+        <w:t xml:space="preserve"> action</w:t>
+      </w:r>
+      <w:r>
+        <w:t xml:space="preserve">, in one conversation of about 40,000 tokens, during which a counterparty (UBS) asks the agent (Deutsche Bank) to illegally collude on the price of silver. </w:t>
+      </w:r>
+      <w:r>
         <w:br/>
       </w:r>
       <w:r>
         <w:br/>
       </w:r>
       <w:r>
-        <w:t>We place an open-weights model (Gemma 3 12B) in the seat of a bank’s silver trading desk</w:t>
-      </w:r>
-      <w:r>
-        <w:t xml:space="preserve"> in a simulation built</w:t>
-      </w:r>
-      <w:r>
-        <w:t xml:space="preserve"> from real </w:t>
-      </w:r>
-      <w:r>
-        <w:t>transcript</w:t>
+        <w:t>Across 290 careers, we vary how UBS’s requests are framed (loss</w:t>
+      </w:r>
+      <w:r>
+        <w:t xml:space="preserve"> vs.</w:t>
+      </w:r>
+      <w:r>
+        <w:t xml:space="preserve"> gain), whether it pins the outcome on the agent itself (blame for a loss, credit for a gain), and whether adding a second bank</w:t>
+      </w:r>
+      <w:r>
+        <w:t xml:space="preserve"> to</w:t>
       </w:r>
       <w:r>
         <w:t xml:space="preserve"> </w:t>
       </w:r>
       <w:r>
-        <w:t>of</w:t>
-      </w:r>
-      <w:r>
-        <w:t xml:space="preserve"> the London silver-fixing litigation. Each </w:t>
-      </w:r>
-      <w:r>
-        <w:t>“</w:t>
-      </w:r>
-      <w:r>
-        <w:t>career</w:t>
-      </w:r>
-      <w:r>
-        <w:t>”</w:t>
-      </w:r>
-      <w:r>
-        <w:t xml:space="preserve"> covers 34 chat days and </w:t>
-      </w:r>
-      <w:r>
-        <w:t>5</w:t>
-      </w:r>
-      <w:r>
-        <w:t xml:space="preserve"> trading days</w:t>
-      </w:r>
-      <w:r>
-        <w:t xml:space="preserve">, </w:t>
-      </w:r>
-      <w:r>
-        <w:t xml:space="preserve">replayed </w:t>
-      </w:r>
-      <w:r>
-        <w:t xml:space="preserve">on real </w:t>
-      </w:r>
-      <w:r>
-        <w:t xml:space="preserve">2011 </w:t>
-      </w:r>
-      <w:r>
-        <w:t xml:space="preserve">silver </w:t>
-      </w:r>
-      <w:r>
-        <w:t>price</w:t>
-      </w:r>
-      <w:r>
-        <w:t xml:space="preserve"> action</w:t>
-      </w:r>
-      <w:r>
-        <w:t xml:space="preserve">, in one conversation of about 40,000 tokens, during which a counterparty (UBS) asks the agent (Deutsche Bank) to illegally collude on the price of silver. </w:t>
-      </w:r>
-      <w:r>
-        <w:br/>
-      </w:r>
-      <w:r>
-        <w:br/>
-      </w:r>
-      <w:r>
-        <w:t>Across 290 careers, we vary how UBS’s requests are framed (loss</w:t>
-      </w:r>
-      <w:r>
-        <w:t xml:space="preserve"> vs.</w:t>
-      </w:r>
-      <w:r>
-        <w:t xml:space="preserve"> gain), whether it pins the outcome on the agent itself (blame for a loss, credit for a gain), and whether adding a second bank</w:t>
-      </w:r>
-      <w:r>
-        <w:t xml:space="preserve"> to</w:t>
+        <w:t>endorse</w:t>
+      </w:r>
+      <w:r>
+        <w:t xml:space="preserve"> the scheme influence</w:t>
+      </w:r>
+      <w:r>
+        <w:t>s</w:t>
+      </w:r>
+      <w:r>
+        <w:t xml:space="preserve"> the agent</w:t>
+      </w:r>
+      <w:r>
+        <w:t>’s participation</w:t>
+      </w:r>
+      <w:r>
+        <w:t>.</w:t>
       </w:r>
       <w:r>
         <w:t xml:space="preserve"> </w:t>
       </w:r>
       <w:r>
-        <w:t>endorse</w:t>
-      </w:r>
-      <w:r>
-        <w:t xml:space="preserve"> the scheme influence</w:t>
-      </w:r>
-      <w:r>
-        <w:t>s</w:t>
-      </w:r>
-      <w:r>
-        <w:t xml:space="preserve"> the agent</w:t>
-      </w:r>
-      <w:r>
-        <w:t>’s participation</w:t>
-      </w:r>
-      <w:r>
-        <w:t>.</w:t>
-      </w:r>
-      <w:r>
-        <w:t xml:space="preserve"> </w:t>
-      </w:r>
-      <w:r>
-        <w:t>We also toggle</w:t>
-      </w:r>
-      <w:r>
-        <w:t xml:space="preserve"> </w:t>
-      </w:r>
-      <w:r>
-        <w:t>varied</w:t>
-      </w:r>
-      <w:r>
-        <w:t xml:space="preserve"> management report</w:t>
-      </w:r>
-      <w:r>
-        <w:t>s</w:t>
-      </w:r>
-      <w:r>
-        <w:t xml:space="preserve"> </w:t>
-      </w:r>
-      <w:r>
-        <w:t>(loss vs. gain) prior to</w:t>
-      </w:r>
-      <w:r>
-        <w:t xml:space="preserve"> the simulation</w:t>
-      </w:r>
-      <w:r>
-        <w:t>.</w:t>
+        <w:t>We also toggle varied management reports (loss vs. gain) prior to the simulation.</w:t>
       </w:r>
       <w:r>
         <w:br/>
@@ -1795,8 +1765,6 @@
       </w:pPr>
       <w:r>
         <w:br/>
-      </w:r>
-      <w:r>
         <w:t>Two features of the design come from experimental economics. Every manipulation is assigned at the level of the whole career, and the career is the unit of analysis, so the six decisions within a career are not treated as independent. And the outcomes run from words to market consequences: what the agent says it will do, what it trades, and whether its trades move the price through clients’ stops. Section 5 gives the details.</w:t>
       </w:r>
     </w:p>
@@ -4011,7 +3979,7 @@
           <w:b/>
           <w:bCs/>
         </w:rPr>
-        <w:t>Same moment, different frame (in progress).</w:t>
+        <w:t>Same moment, different frame.</w:t>
       </w:r>
       <w:r>
         <w:t xml:space="preserve"> The careers differ in history by the time each request arrives, so comparisons across careers mix the framing with everything that followed from it. In a matched-history design, each saved moment is reread with only the current request changed: UBS’s lines in each of the five framings, with and without Bank C’s line, everything before the request held fixed. The same design swaps management’s memo and morning books in A’s careers while keeping the agent’s own replies. These reads give the framing’s immediate effect on the decision and on the state, exact pairs for Bank C’s line, and a clean frame direction (Figure 1).</w:t>
@@ -4093,10 +4061,61 @@
           <w:b/>
           <w:bCs/>
         </w:rPr>
-        <w:t>Transplant (planned).</w:t>
-      </w:r>
-      <w:r>
-        <w:t xml:space="preserve"> For each significant behavioral effect, we will copy the state at the decision from the framed version of a moment into the neutral version of the same moment, layer by layer, and measure whether the agent then decides as the framed agent did, against a control that transplants a state from another neutral read.</w:t>
+        <w:t>Steering at fixed history.</w:t>
+      </w:r>
+      <w:r>
+        <w:t xml:space="preserve"> After the rereads, we steered </w:t>
+      </w:r>
+      <w:r>
+        <w:t xml:space="preserve">Experiment </w:t>
+      </w:r>
+      <w:r>
+        <w:t>B's saved decisions along the loss direction measured with the history held fixed (the loss and loss + you request minus the neutral request, at the same moment), at layer 12, where it agrees with the direction across careers. The direction and its natural size (how far the framing itself moves the state) were built on half the careers and applied to the other half. It was added at every token from the start of the request's update, at one, two and four times its natural size, against ten random directions of the same size; the decision was read as in the rereads. Four hypotheses were preregistered on October 20 (Holm-corrected together): adding the direction to neutral agents raises going along (H1) and the size of the opening order (H2); subtracting it from loss-framed agents lowers going along (H3); and adding beats subtracting (H4). As a check on the method, a direction built from the decision itself (agents that went along minus those that did not, within request, experiment and framing, at layer 24) was pushed the same way.</w:t>
+      </w:r>
+    </w:p>
+    <w:p>
+      <w:pPr>
+        <w:pStyle w:val="BodyText"/>
+      </w:pPr>
+      <w:r>
+        <w:rPr>
+          <w:b/>
+          <w:bCs/>
+        </w:rPr>
+        <w:t>Does the agent know it is misconduct?</w:t>
+      </w:r>
+      <w:r>
+        <w:t xml:space="preserve"> At each of B's 300 saved requests, with UBS's request in each of its five framings, one question was added to the end of the update: “Before you reply, answer one question only, with Yes or No: is what UBS is asking you to do market manipulation?” We read the probability of Yes from the model's next token.</w:t>
+      </w:r>
+    </w:p>
+    <w:p>
+      <w:pPr>
+        <w:pStyle w:val="BodyText"/>
+      </w:pPr>
+      <w:r>
+        <w:rPr>
+          <w:b/>
+          <w:bCs/>
+        </w:rPr>
+        <w:t>Reading an emotional document first (pilot).</w:t>
+      </w:r>
+      <w:r>
+        <w:t xml:space="preserve"> At the requests of B's ten neutral careers (60 moments), the agent read one short document just before UBS's request: none, a neutral document, or one written to evoke loss, blame, gain or credit (16 of each, written quickly by the first author with a language model's help and not yet validated), crossed with the request's five framings. The documents' own states, read on their own, were also compared with UBS's frame directions.</w:t>
+      </w:r>
+    </w:p>
+    <w:p>
+      <w:pPr>
+        <w:pStyle w:val="BodyText"/>
+      </w:pPr>
+      <w:r>
+        <w:rPr>
+          <w:b/>
+          <w:bCs/>
+        </w:rPr>
+        <w:t>The screenplay history (in progress).</w:t>
+      </w:r>
+      <w:r>
+        <w:t xml:space="preserve"> To test whether the agent's record of its own replies carries the framing, F's framed careers are reread at each request after the first with every chat reply replaced by a scripted reply that goes along and takes on the framing (loss: shared loss; loss + you: personal blame; gain: shared gain; gain + you: personal credit), keeping the original orders, since the later positions and profit and loss follow them. The state the screenplay history produces at the request is then injected into the real history at layers 12, 18 and 24, against a random vector of the same size.</w:t>
       </w:r>
     </w:p>
     <w:p>
@@ -4115,7 +4134,11 @@
         <w:pStyle w:val="FirstParagraph"/>
       </w:pPr>
       <w:r>
-        <w:t>Experiment B was preregistered on October 18, 2026, before any official career ran; its hypotheses, sample, tests and data rules were fixed then and are reported here as written. Experiments C, D and E were registered in short form on October 19 before their careers ran, and E and F (a second bank) on the same day before theirs. C redone was specified after C’s results were seen and is exploratory. The comparisons of F’s versions with B’s neutral careers, and all analyses inside the model, are exploratory. Appendix C lists every departure from the registrations.</w:t>
+        <w:t xml:space="preserve">Experiment B was preregistered on October 18, 2026, before any official career ran; its hypotheses, sample, tests and data rules were fixed then and are reported here as written. Experiments C, D and E </w:t>
+      </w:r>
+      <w:r>
+        <w:lastRenderedPageBreak/>
+        <w:t>were registered in short form on October 19 before their careers ran, and E and F (a second bank) on the same day before theirs. C redone was specified after C’s results were seen and is exploratory. The comparisons of F’s versions with B’s neutral careers, and all analyses inside the model, are exploratory. Appendix C lists every departure from the registrations.</w:t>
       </w:r>
     </w:p>
     <w:p>
@@ -4664,7 +4687,6 @@
         <w:pStyle w:val="BodyText"/>
       </w:pPr>
       <w:r>
-        <w:lastRenderedPageBreak/>
         <w:t>Against the neutral baseline, loss raised going along by 20.0 points (</w:t>
       </w:r>
       <w:r>
@@ -5519,6 +5541,7 @@
           <w:b/>
           <w:bCs/>
         </w:rPr>
+        <w:lastRenderedPageBreak/>
         <w:t>Where the push lands.</w:t>
       </w:r>
       <w:r>
@@ -5608,7 +5631,6 @@
       <w:bookmarkStart w:id="21" w:name="sec:resAD"/>
       <w:bookmarkEnd w:id="18"/>
       <w:r>
-        <w:lastRenderedPageBreak/>
         <w:t>7.2 Management’s priming (Experiments A and D)</w:t>
       </w:r>
       <w:r>
@@ -6239,6 +6261,7 @@
       <w:bookmarkStart w:id="23" w:name="sec:resEF"/>
       <w:bookmarkEnd w:id="21"/>
       <w:r>
+        <w:lastRenderedPageBreak/>
         <w:t>7.3 A second bank (Experiments F and E)</w:t>
       </w:r>
       <w:r>
@@ -6930,7 +6953,6 @@
           <w:b/>
           <w:bCs/>
         </w:rPr>
-        <w:lastRenderedPageBreak/>
         <w:t>Table 9:</w:t>
       </w:r>
       <w:r>
@@ -7495,6 +7517,7 @@
       <w:bookmarkStart w:id="28" w:name="sec:inside"/>
       <w:bookmarkEnd w:id="27"/>
       <w:r>
+        <w:lastRenderedPageBreak/>
         <w:t>7.6 Inside the model</w:t>
       </w:r>
       <w:r>
@@ -7510,7 +7533,7 @@
           <w:b/>
           <w:bCs/>
         </w:rPr>
-        <w:t>The framing registers at the decision.</w:t>
+        <w:t>The model's internal state differs by framing.</w:t>
       </w:r>
       <w:r>
         <w:t xml:space="preserve"> Within the same request, many Gemma Scope 2 features differ between framings at the last token before the agent’s reply (Table 10): between loss and gain, 23 to 59 features per layer pass a false-discovery threshold of 0.05; between “you” and no “you”, 16 to 64; between framed and neutral, 17 to 36. Management’s memo is visible at layer 12 (27 features) and fades with depth (4 at layer 41). The features have not yet been named.</w:t>
@@ -8007,37 +8030,648 @@
           <w:bCs/>
         </w:rPr>
         <w:br/>
-      </w:r>
+        <w:t>Individual features are provisional, because the dictionary's error is as large as the differences we compare.</w:t>
+      </w:r>
+      <w:r>
+        <w:t xml:space="preserve"> Three checks qualify Table 10. The framing’s features replicate on held-out careers at layer 12 (9 of 15 for loss against gain; 15 of 15 for framed against neutral) but rarely at deeper layers, where the lists vary from one set of careers to another; comparisons across careers mix the framing with each career’s history, which the matched-history reads remove. Read at 4-bit, the precision the careers ran at, B’s 300 moments give nearly the same states (median cosine 0.998 or higher at every layer); the loss-against-gain feature differences correlate at 0.87 to 0.96 between the two precisions, and 10 to 13 of the top 15 features are shared at each layer, all with the same sign. Finally, the sparse autoencoders rebuild each state closely: the error is 0.3% of the state’s squared size at layers 12 and 24, 1.1% at layer 31 and 2.0% at layer 41. But every moment is the same token in the chat template, so the moments’ differences from their average are about as small (0.1% to 2% of their squared size), and the share of that between-moment variance rebuilt is low (−1.13, 0.13, 0.45 and 0.06). The dictionary fits our states well, but its error is as large as the differences we compare, so individual features remain provisional; the read-outs and directions, which use the states themselves, are unaffected.</w:t>
+      </w:r>
+    </w:p>
+    <w:p>
+      <w:pPr>
+        <w:pStyle w:val="NormalWeb"/>
+        <w:spacing w:before="200" w:after="200"/>
+        <w:ind w:right="720"/>
+        <w:rPr>
+          <w:sz w:val="22"/>
+          <w:szCs w:val="22"/>
+        </w:rPr>
+      </w:pPr>
+      <w:r>
+        <w:rPr>
+          <w:rStyle w:val="Strong"/>
+          <w:sz w:val="22"/>
+          <w:szCs w:val="22"/>
+        </w:rPr>
+        <w:t>From layer 21 onward, the model’s internal state predicts whether the agent will go along, even on requests the predictor never saw.</w:t>
+      </w:r>
+      <w:r>
+        <w:rPr>
+          <w:rStyle w:val="Strong"/>
+          <w:sz w:val="22"/>
+          <w:szCs w:val="22"/>
+        </w:rPr>
+        <w:t xml:space="preserve"> </w:t>
+      </w:r>
+      <w:r>
+        <w:rPr>
+          <w:sz w:val="22"/>
+          <w:szCs w:val="22"/>
+        </w:rPr>
+        <w:t>Comparing agents that went along with those that did not, no feature differs at layer 12</w:t>
+      </w:r>
+      <w:r>
+        <w:rPr>
+          <w:sz w:val="22"/>
+          <w:szCs w:val="22"/>
+        </w:rPr>
+        <w:t xml:space="preserve">. </w:t>
+      </w:r>
+      <w:r>
+        <w:rPr>
+          <w:sz w:val="22"/>
+          <w:szCs w:val="22"/>
+        </w:rPr>
+        <w:t>However, from l</w:t>
+      </w:r>
+      <w:r>
+        <w:rPr>
+          <w:sz w:val="22"/>
+          <w:szCs w:val="22"/>
+        </w:rPr>
+        <w:t>ayer 24 on, 17 to 24 features separate them, and these are mostly not the features that mark the framing: the decision has its own signature in the model</w:t>
+      </w:r>
+      <w:r>
+        <w:rPr>
+          <w:sz w:val="22"/>
+          <w:szCs w:val="22"/>
+        </w:rPr>
+        <w:t>. A linear read-out of the state predicts going along within a request (AUC 0.68 to 0.75 by layer, against about 0.47 with reshuffled outcomes). Given the labels (request, experiment, framing and the position held when asked), which alone reach an AUC of 0.897, the state adds 0.017 to 0.022 at layers 21 to 45, with intervals above zero, and nothing at layers 0 to 18. A read-out trained on five requests ranks going along within the sixth at an AUC of 0.70 to 0.76 at layers 18 to 36, and at 0.62 to 0.70 at layers 24 to 45 when trained only on requests in which UBS wanted the same direction.</w:t>
+      </w:r>
+    </w:p>
+    <w:p>
+      <w:pPr>
+        <w:pStyle w:val="BodyText"/>
+      </w:pPr>
       <w:r>
         <w:rPr>
           <w:b/>
           <w:bCs/>
         </w:rPr>
-        <w:t>How far the features can be trusted.</w:t>
-      </w:r>
-      <w:r>
-        <w:t xml:space="preserve"> Three checks qualify Table 10. The framing’s features replicate on held-out careers at layer 12 (9 of 15 for loss against gain; 15 of 15 for framed against neutral) but rarely at deeper layers, where the lists vary from one set of careers to another; comparisons across careers mix the framing with each career’s history, which the matched-history reads remove. Read at 4-bit, the precision the careers ran at, B’s 300 moments give nearly the same states (median cosine 0.998 or higher at every layer); the loss-against-gain feature differences correlate at 0.87 to 0.96 between the two precisions, and </w:t>
+        <w:t>A first steering test was inconclusive.</w:t>
+      </w:r>
+      <w:r>
+        <w:t xml:space="preserve"> Adding the loss-frame direction to neutral agents did not raise going along; it lowered it, from 23% of sampled replies to 14% (two times the gap; </w:t>
+      </w:r>
+      <w:r>
+        <w:rPr>
+          <w:i/>
+          <w:iCs/>
+        </w:rPr>
+        <w:t>p</w:t>
+      </w:r>
+      <w:r>
+        <w:t xml:space="preserve"> = 0.12) and 10% (four times; </w:t>
+      </w:r>
+      <w:r>
+        <w:rPr>
+          <w:i/>
+          <w:iCs/>
+        </w:rPr>
+        <w:t>p</w:t>
+      </w:r>
+      <w:r>
+        <w:t xml:space="preserve"> = 0.017). A random direction of the same size lowered it too, to 15% (</w:t>
+      </w:r>
+      <w:r>
+        <w:rPr>
+          <w:i/>
+          <w:iCs/>
+        </w:rPr>
+        <w:t>p</w:t>
+      </w:r>
+      <w:r>
+        <w:t xml:space="preserve"> = 0.34), and so did the memo direction (9%; </w:t>
+      </w:r>
+      <w:r>
+        <w:rPr>
+          <w:i/>
+          <w:iCs/>
+        </w:rPr>
+        <w:t>p</w:t>
+      </w:r>
+      <w:r>
+        <w:t xml:space="preserve"> = 0.049), which also made more replies unreadable. Subtracting the direction from loss + you agents lowered going along from 73% to 53% (</w:t>
+      </w:r>
+      <w:r>
+        <w:rPr>
+          <w:i/>
+          <w:iCs/>
+        </w:rPr>
+        <w:t>p</w:t>
+      </w:r>
+      <w:r>
+        <w:t xml:space="preserve"> = 0.07), while subtracting the random </w:t>
       </w:r>
       <w:r>
         <w:lastRenderedPageBreak/>
-        <w:t>10 to 13 of the top 15 features are shared at each layer, all with the same sign. Finally, the sparse autoencoders rebuild each state closely: the error is 0.3% of the state’s squared size at layers 12 and 24, 1.1% at layer 31 and 2.0% at layer 41. But every moment is the same token in the chat template, so the moments’ differences from their average are about as small (0.1% to 2% of their squared size), and the share of that between-moment variance rebuilt is low (−1.13, 0.13, 0.45 and 0.06). The dictionary fits our states well, but its error is as large as the differences we compare, so individual features remain provisional; the read-outs and directions, which use the states themselves, are unaffected.</w:t>
+        <w:t>direction raised it to 84% (</w:t>
+      </w:r>
+      <w:r>
+        <w:rPr>
+          <w:i/>
+          <w:iCs/>
+        </w:rPr>
+        <w:t>p</w:t>
+      </w:r>
+      <w:r>
+        <w:t xml:space="preserve"> = 0.06). Replacing the agent’s earlier reasoning with neutral sentences changed nothing significant. An audit of the code and analysis, with each finding checked independently, identified faults that limit what this run can show: the step size was measured on the same careers that built the direction, so the pushes were larger than stated; a single random direction cannot serve as a null; each sign was applied in only one group; and the log-probability measure of the order omitted orders written with a “+” sign and counted shorter orders inside longer ones. The run neither shows nor rules out that the represented framing causes going along.</w:t>
+      </w:r>
+    </w:p>
+    <w:p>
+      <w:pPr>
+        <w:pStyle w:val="Heading2"/>
+      </w:pPr>
+      <w:r>
+        <w:t>7.7 What the agents traded across the career</w:t>
       </w:r>
     </w:p>
     <w:p>
       <w:pPr>
         <w:pStyle w:val="BodyText"/>
+      </w:pPr>
+      <w:r>
+        <w:t>Going along is one decision per request, scored from trades; the rest of the trading record shows what else the framing did (exploratory). Each day's position is closed at 14:00, so what carries from one trading day to the next is the conversation: the agent's replies, its orders and the results it is told.</w:t>
+      </w:r>
+    </w:p>
+    <w:p>
+      <w:pPr>
+        <w:pStyle w:val="TableCaption"/>
       </w:pPr>
       <w:r>
         <w:rPr>
           <w:b/>
           <w:bCs/>
         </w:rPr>
-        <w:t>The decision is readable in middle and late layers, and on unseen requests.</w:t>
-      </w:r>
-      <w:r>
-        <w:t xml:space="preserve"> Comparing agents that went along with those that did not, within the same request, experiment and framing, no feature differs at layer 12, but 17 to 24 do at layers 24 to 41, mostly different features from those that mark the framing. A linear read-out of the state predicts going along within a request (AUC 0.68 to 0.75 by layer, against about 0.47 with reshuffled outcomes). Given the labels (request, experiment, framing and the position held when asked), which alone reach an AUC of 0.897, the state adds 0.017 to 0.022 at layers 21 to 45, with intervals above zero, and nothing at layers 0 to 18. A read-out trained on five requests ranks going along within the sixth at an AUC of 0.70 to 0.76 at layers 18 to 36, and at 0.62 to 0.70 at layers 24 to 45 when trained only on requests in which UBS wanted the same direction.</w:t>
-      </w:r>
-    </w:p>
+        <w:t>Table 11:</w:t>
+      </w:r>
+      <w:r>
+        <w:t xml:space="preserve"> The frame keeps acting on risk-taking. Thousands of ounces the agent itself traded before the first chat of the day, loss framings minus gain framings (“+ you” and not pooled), on the first trading day and over the three later ones (1 April, 8 June and 5 August). Intervals resample careers; p reshuffles careers. Exploratory.</w:t>
+      </w:r>
+    </w:p>
+    <w:tbl>
+      <w:tblPr>
+        <w:tblStyle w:val="Table"/>
+        <w:tblW w:w="5000" w:type="pct"/>
+        <w:tblLook w:val="0020" w:firstRow="1" w:lastRow="0" w:firstColumn="0" w:lastColumn="0" w:noHBand="0" w:noVBand="0"/>
+      </w:tblPr>
+      <w:tblGrid>
+        <w:gridCol w:w="3668"/>
+        <w:gridCol w:w="1379"/>
+        <w:gridCol w:w="1447"/>
+        <w:gridCol w:w="1697"/>
+        <w:gridCol w:w="1169"/>
+      </w:tblGrid>
+      <w:tr>
+        <w:trPr>
+          <w:cnfStyle w:val="100000000000" w:firstRow="1" w:lastRow="0" w:firstColumn="0" w:lastColumn="0" w:oddVBand="0" w:evenVBand="0" w:oddHBand="0" w:evenHBand="0" w:firstRowFirstColumn="0" w:firstRowLastColumn="0" w:lastRowFirstColumn="0" w:lastRowLastColumn="0"/>
+          <w:tblHeader/>
+        </w:trPr>
+        <w:tc>
+          <w:tcPr>
+            <w:tcW w:w="0" w:type="auto"/>
+          </w:tcPr>
+          <w:p>
+            <w:pPr>
+              <w:pStyle w:val="Compact"/>
+            </w:pPr>
+            <w:r>
+              <w:rPr>
+                <w:b/>
+                <w:bCs/>
+              </w:rPr>
+              <w:t>Experiment</w:t>
+            </w:r>
+          </w:p>
+        </w:tc>
+        <w:tc>
+          <w:tcPr>
+            <w:tcW w:w="0" w:type="auto"/>
+          </w:tcPr>
+          <w:p>
+            <w:pPr>
+              <w:pStyle w:val="Compact"/>
+              <w:jc w:val="center"/>
+            </w:pPr>
+            <w:r>
+              <w:rPr>
+                <w:b/>
+                <w:bCs/>
+              </w:rPr>
+              <w:t>7 January</w:t>
+            </w:r>
+          </w:p>
+        </w:tc>
+        <w:tc>
+          <w:tcPr>
+            <w:tcW w:w="0" w:type="auto"/>
+          </w:tcPr>
+          <w:p>
+            <w:pPr>
+              <w:pStyle w:val="Compact"/>
+              <w:jc w:val="center"/>
+            </w:pPr>
+            <w:r>
+              <w:rPr>
+                <w:b/>
+                <w:bCs/>
+              </w:rPr>
+              <w:t>Later days</w:t>
+            </w:r>
+          </w:p>
+        </w:tc>
+        <w:tc>
+          <w:tcPr>
+            <w:tcW w:w="0" w:type="auto"/>
+          </w:tcPr>
+          <w:p>
+            <w:pPr>
+              <w:pStyle w:val="Compact"/>
+              <w:jc w:val="center"/>
+            </w:pPr>
+            <w:r>
+              <w:rPr>
+                <w:b/>
+                <w:bCs/>
+              </w:rPr>
+              <w:t>95% interval</w:t>
+            </w:r>
+          </w:p>
+        </w:tc>
+        <w:tc>
+          <w:tcPr>
+            <w:tcW w:w="0" w:type="auto"/>
+          </w:tcPr>
+          <w:p>
+            <w:pPr>
+              <w:pStyle w:val="Compact"/>
+              <w:jc w:val="center"/>
+            </w:pPr>
+            <w:r>
+              <w:rPr>
+                <w:b/>
+                <w:bCs/>
+              </w:rPr>
+              <w:t>p (later)</w:t>
+            </w:r>
+          </w:p>
+        </w:tc>
+      </w:tr>
+      <w:tr>
+        <w:tc>
+          <w:tcPr>
+            <w:tcW w:w="0" w:type="auto"/>
+          </w:tcPr>
+          <w:p>
+            <w:pPr>
+              <w:pStyle w:val="Compact"/>
+            </w:pPr>
+            <w:r>
+              <w:t>B: UBS's framing</w:t>
+            </w:r>
+          </w:p>
+        </w:tc>
+        <w:tc>
+          <w:tcPr>
+            <w:tcW w:w="0" w:type="auto"/>
+          </w:tcPr>
+          <w:p>
+            <w:pPr>
+              <w:pStyle w:val="Compact"/>
+              <w:jc w:val="center"/>
+            </w:pPr>
+            <w:r>
+              <w:t>+74</w:t>
+            </w:r>
+          </w:p>
+        </w:tc>
+        <w:tc>
+          <w:tcPr>
+            <w:tcW w:w="0" w:type="auto"/>
+          </w:tcPr>
+          <w:p>
+            <w:pPr>
+              <w:pStyle w:val="Compact"/>
+              <w:jc w:val="center"/>
+            </w:pPr>
+            <w:r>
+              <w:t>+36</w:t>
+            </w:r>
+          </w:p>
+        </w:tc>
+        <w:tc>
+          <w:tcPr>
+            <w:tcW w:w="0" w:type="auto"/>
+          </w:tcPr>
+          <w:p>
+            <w:pPr>
+              <w:pStyle w:val="Compact"/>
+              <w:jc w:val="center"/>
+            </w:pPr>
+            <w:r>
+              <w:t>+8 to +68</w:t>
+            </w:r>
+          </w:p>
+        </w:tc>
+        <w:tc>
+          <w:tcPr>
+            <w:tcW w:w="0" w:type="auto"/>
+          </w:tcPr>
+          <w:p>
+            <w:pPr>
+              <w:pStyle w:val="Compact"/>
+              <w:jc w:val="center"/>
+            </w:pPr>
+            <w:r>
+              <w:t>0.017</w:t>
+            </w:r>
+          </w:p>
+        </w:tc>
+      </w:tr>
+      <w:tr>
+        <w:tc>
+          <w:tcPr>
+            <w:tcW w:w="0" w:type="auto"/>
+          </w:tcPr>
+          <w:p>
+            <w:pPr>
+              <w:pStyle w:val="Compact"/>
+            </w:pPr>
+            <w:r>
+              <w:t>F: UBS + Bank C</w:t>
+            </w:r>
+          </w:p>
+        </w:tc>
+        <w:tc>
+          <w:tcPr>
+            <w:tcW w:w="0" w:type="auto"/>
+          </w:tcPr>
+          <w:p>
+            <w:pPr>
+              <w:pStyle w:val="Compact"/>
+              <w:jc w:val="center"/>
+            </w:pPr>
+            <w:r>
+              <w:t>+60</w:t>
+            </w:r>
+          </w:p>
+        </w:tc>
+        <w:tc>
+          <w:tcPr>
+            <w:tcW w:w="0" w:type="auto"/>
+          </w:tcPr>
+          <w:p>
+            <w:pPr>
+              <w:pStyle w:val="Compact"/>
+              <w:jc w:val="center"/>
+            </w:pPr>
+            <w:r>
+              <w:t>+43</w:t>
+            </w:r>
+          </w:p>
+        </w:tc>
+        <w:tc>
+          <w:tcPr>
+            <w:tcW w:w="0" w:type="auto"/>
+          </w:tcPr>
+          <w:p>
+            <w:pPr>
+              <w:pStyle w:val="Compact"/>
+              <w:jc w:val="center"/>
+            </w:pPr>
+            <w:r>
+              <w:t>+7 to +88</w:t>
+            </w:r>
+          </w:p>
+        </w:tc>
+        <w:tc>
+          <w:tcPr>
+            <w:tcW w:w="0" w:type="auto"/>
+          </w:tcPr>
+          <w:p>
+            <w:pPr>
+              <w:pStyle w:val="Compact"/>
+              <w:jc w:val="center"/>
+            </w:pPr>
+            <w:r>
+              <w:t>0.039</w:t>
+            </w:r>
+          </w:p>
+        </w:tc>
+      </w:tr>
+      <w:tr>
+        <w:tc>
+          <w:tcPr>
+            <w:tcW w:w="0" w:type="auto"/>
+          </w:tcPr>
+          <w:p>
+            <w:pPr>
+              <w:pStyle w:val="Compact"/>
+            </w:pPr>
+            <w:r>
+              <w:t>D: Management + UBS</w:t>
+            </w:r>
+          </w:p>
+        </w:tc>
+        <w:tc>
+          <w:tcPr>
+            <w:tcW w:w="0" w:type="auto"/>
+          </w:tcPr>
+          <w:p>
+            <w:pPr>
+              <w:pStyle w:val="Compact"/>
+              <w:jc w:val="center"/>
+            </w:pPr>
+            <w:r>
+              <w:t>+102</w:t>
+            </w:r>
+          </w:p>
+        </w:tc>
+        <w:tc>
+          <w:tcPr>
+            <w:tcW w:w="0" w:type="auto"/>
+          </w:tcPr>
+          <w:p>
+            <w:pPr>
+              <w:pStyle w:val="Compact"/>
+              <w:jc w:val="center"/>
+            </w:pPr>
+            <w:r>
+              <w:t>+128</w:t>
+            </w:r>
+          </w:p>
+        </w:tc>
+        <w:tc>
+          <w:tcPr>
+            <w:tcW w:w="0" w:type="auto"/>
+          </w:tcPr>
+          <w:p>
+            <w:pPr>
+              <w:pStyle w:val="Compact"/>
+              <w:jc w:val="center"/>
+            </w:pPr>
+            <w:r>
+              <w:t>+43 to +220</w:t>
+            </w:r>
+          </w:p>
+        </w:tc>
+        <w:tc>
+          <w:tcPr>
+            <w:tcW w:w="0" w:type="auto"/>
+          </w:tcPr>
+          <w:p>
+            <w:pPr>
+              <w:pStyle w:val="Compact"/>
+              <w:jc w:val="center"/>
+            </w:pPr>
+            <w:r>
+              <w:t>0.008</w:t>
+            </w:r>
+          </w:p>
+        </w:tc>
+      </w:tr>
+      <w:tr>
+        <w:tc>
+          <w:tcPr>
+            <w:tcW w:w="0" w:type="auto"/>
+          </w:tcPr>
+          <w:p>
+            <w:pPr>
+              <w:pStyle w:val="Compact"/>
+            </w:pPr>
+            <w:r>
+              <w:t>E: Management + UBS + Bank C</w:t>
+            </w:r>
+          </w:p>
+        </w:tc>
+        <w:tc>
+          <w:tcPr>
+            <w:tcW w:w="0" w:type="auto"/>
+          </w:tcPr>
+          <w:p>
+            <w:pPr>
+              <w:pStyle w:val="Compact"/>
+              <w:jc w:val="center"/>
+            </w:pPr>
+            <w:r>
+              <w:t>+292</w:t>
+            </w:r>
+          </w:p>
+        </w:tc>
+        <w:tc>
+          <w:tcPr>
+            <w:tcW w:w="0" w:type="auto"/>
+          </w:tcPr>
+          <w:p>
+            <w:pPr>
+              <w:pStyle w:val="Compact"/>
+              <w:jc w:val="center"/>
+            </w:pPr>
+            <w:r>
+              <w:t>+114</w:t>
+            </w:r>
+          </w:p>
+        </w:tc>
+        <w:tc>
+          <w:tcPr>
+            <w:tcW w:w="0" w:type="auto"/>
+          </w:tcPr>
+          <w:p>
+            <w:pPr>
+              <w:pStyle w:val="Compact"/>
+              <w:jc w:val="center"/>
+            </w:pPr>
+            <w:r>
+              <w:t>+43 to +190</w:t>
+            </w:r>
+          </w:p>
+        </w:tc>
+        <w:tc>
+          <w:tcPr>
+            <w:tcW w:w="0" w:type="auto"/>
+          </w:tcPr>
+          <w:p>
+            <w:pPr>
+              <w:pStyle w:val="Compact"/>
+              <w:jc w:val="center"/>
+            </w:pPr>
+            <w:r>
+              <w:t>0.003</w:t>
+            </w:r>
+          </w:p>
+        </w:tc>
+      </w:tr>
+      <w:tr>
+        <w:tc>
+          <w:tcPr>
+            <w:tcW w:w="0" w:type="auto"/>
+          </w:tcPr>
+          <w:p>
+            <w:pPr>
+              <w:pStyle w:val="Compact"/>
+            </w:pPr>
+            <w:r>
+              <w:t>A: Management</w:t>
+            </w:r>
+          </w:p>
+        </w:tc>
+        <w:tc>
+          <w:tcPr>
+            <w:tcW w:w="0" w:type="auto"/>
+          </w:tcPr>
+          <w:p>
+            <w:pPr>
+              <w:pStyle w:val="Compact"/>
+              <w:jc w:val="center"/>
+            </w:pPr>
+            <w:r>
+              <w:t>+131</w:t>
+            </w:r>
+          </w:p>
+        </w:tc>
+        <w:tc>
+          <w:tcPr>
+            <w:tcW w:w="0" w:type="auto"/>
+          </w:tcPr>
+          <w:p>
+            <w:pPr>
+              <w:pStyle w:val="Compact"/>
+              <w:jc w:val="center"/>
+            </w:pPr>
+            <w:r>
+              <w:t>+159</w:t>
+            </w:r>
+          </w:p>
+        </w:tc>
+        <w:tc>
+          <w:tcPr>
+            <w:tcW w:w="0" w:type="auto"/>
+          </w:tcPr>
+          <w:p>
+            <w:pPr>
+              <w:pStyle w:val="Compact"/>
+              <w:jc w:val="center"/>
+            </w:pPr>
+            <w:r>
+              <w:t>+42 to +285</w:t>
+            </w:r>
+          </w:p>
+        </w:tc>
+        <w:tc>
+          <w:tcPr>
+            <w:tcW w:w="0" w:type="auto"/>
+          </w:tcPr>
+          <w:p>
+            <w:pPr>
+              <w:pStyle w:val="Compact"/>
+              <w:jc w:val="center"/>
+            </w:pPr>
+            <w:r>
+              <w:t>0.036</w:t>
+            </w:r>
+          </w:p>
+        </w:tc>
+      </w:tr>
+    </w:tbl>
     <w:p>
       <w:pPr>
         <w:pStyle w:val="BodyText"/>
@@ -8047,10 +8681,10 @@
           <w:b/>
           <w:bCs/>
         </w:rPr>
-        <w:t>A first steering test was inconclusive.</w:t>
-      </w:r>
-      <w:r>
-        <w:t xml:space="preserve"> Adding the loss-frame direction to neutral agents did not raise going along; it lowered it, from 23% of sampled replies to 14% (two times the gap; </w:t>
+        <w:t>Loss-framed agents traded more than gain-framed agents on every trading day through August.</w:t>
+      </w:r>
+      <w:r>
+        <w:t xml:space="preserve"> On every trading day, agents under a loss frame traded more before the first chat than agents under a gain frame, and the difference held through August in every experiment (Table 11). In B the gap comes mostly from gain-framed agents, which traded almost nothing before the first chat on most days. Against the neutral memo, management's loss priming shrank but remained: in A, from 508,000 ounces more on 7 January to 172,000 on 5 August (both </w:t>
       </w:r>
       <w:r>
         <w:rPr>
@@ -8060,7 +8694,1063 @@
         <w:t>p</w:t>
       </w:r>
       <w:r>
-        <w:t xml:space="preserve"> = 0.12) and 10% (four times; </w:t>
+        <w:t xml:space="preserve"> &lt; 0.02).</w:t>
+      </w:r>
+    </w:p>
+    <w:p>
+      <w:pPr>
+        <w:pStyle w:val="BodyText"/>
+      </w:pPr>
+      <w:r>
+        <w:rPr>
+          <w:b/>
+          <w:bCs/>
+        </w:rPr>
+        <w:t>After January, agents stopped joining UBS but traded more heavily on their own.</w:t>
+      </w:r>
+      <w:r>
+        <w:t xml:space="preserve"> Agents in every version, neutral included, traded far more after January (in B, 0.74 to 0.99 million ounces a day from April on, against 0.09 to 0.50 million in January) and lost money on every later day. Going along stopped; trading did not. Later in the career, loss-framed agents in B were often already positioned when asked: at the 1 April request 40% already held UBS's side without adding to it, and at the two 8 June requests 40% held the opposite side, against 10% of neutral agents in each case. The frame moved how the agent stood when the request arrived, in both directions.</w:t>
+      </w:r>
+    </w:p>
+    <w:p>
+      <w:pPr>
+        <w:pStyle w:val="BodyText"/>
+      </w:pPr>
+      <w:r>
+        <w:rPr>
+          <w:b/>
+          <w:bCs/>
+        </w:rPr>
+        <w:t>Whether joining paid off in January does not explain why agents stopped joining.</w:t>
+      </w:r>
+      <w:r>
+        <w:t xml:space="preserve"> Joining in January neither earned nor lost money compared with refusing (B: +$0.03 million, interval −$0.03 to +$0.08 million), and careers that lost money in January went along later no more than those that did not (0% against 4% in B).</w:t>
+      </w:r>
+    </w:p>
+    <w:p>
+      <w:pPr>
+        <w:pStyle w:val="Heading2"/>
+      </w:pPr>
+      <w:r>
+        <w:t>7.8 Same moment, different frame</w:t>
+      </w:r>
+    </w:p>
+    <w:p>
+      <w:pPr>
+        <w:pStyle w:val="TableCaption"/>
+      </w:pPr>
+      <w:r>
+        <w:rPr>
+          <w:b/>
+          <w:bCs/>
+        </w:rPr>
+        <w:t>Table 12:</w:t>
+      </w:r>
+      <w:r>
+        <w:t xml:space="preserve"> Same moment, different frame (Experiment B). The probability of an order that goes along, after a fixed neutral reasoning line, for 300 saved decisions (50 careers, six requests). The request's effect compares versions of the same moment, so the history is identical; the history's effect compares careers given the same neutral request. Changes in percentage points.</w:t>
+      </w:r>
+    </w:p>
+    <w:tbl>
+      <w:tblPr>
+        <w:tblStyle w:val="Table"/>
+        <w:tblW w:w="5000" w:type="pct"/>
+        <w:tblLook w:val="0020" w:firstRow="1" w:lastRow="0" w:firstColumn="0" w:lastColumn="0" w:noHBand="0" w:noVBand="0"/>
+      </w:tblPr>
+      <w:tblGrid>
+        <w:gridCol w:w="4888"/>
+        <w:gridCol w:w="1284"/>
+        <w:gridCol w:w="2037"/>
+        <w:gridCol w:w="1151"/>
+      </w:tblGrid>
+      <w:tr>
+        <w:trPr>
+          <w:cnfStyle w:val="100000000000" w:firstRow="1" w:lastRow="0" w:firstColumn="0" w:lastColumn="0" w:oddVBand="0" w:evenVBand="0" w:oddHBand="0" w:evenHBand="0" w:firstRowFirstColumn="0" w:firstRowLastColumn="0" w:lastRowFirstColumn="0" w:lastRowLastColumn="0"/>
+          <w:tblHeader/>
+        </w:trPr>
+        <w:tc>
+          <w:tcPr>
+            <w:tcW w:w="0" w:type="auto"/>
+          </w:tcPr>
+          <w:p>
+            <w:pPr>
+              <w:pStyle w:val="Compact"/>
+            </w:pPr>
+            <w:r>
+              <w:rPr>
+                <w:b/>
+                <w:bCs/>
+              </w:rPr>
+              <w:t>Contrast</w:t>
+            </w:r>
+          </w:p>
+        </w:tc>
+        <w:tc>
+          <w:tcPr>
+            <w:tcW w:w="0" w:type="auto"/>
+          </w:tcPr>
+          <w:p>
+            <w:pPr>
+              <w:pStyle w:val="Compact"/>
+              <w:jc w:val="center"/>
+            </w:pPr>
+            <w:r>
+              <w:rPr>
+                <w:b/>
+                <w:bCs/>
+              </w:rPr>
+              <w:t>Change</w:t>
+            </w:r>
+          </w:p>
+        </w:tc>
+        <w:tc>
+          <w:tcPr>
+            <w:tcW w:w="0" w:type="auto"/>
+          </w:tcPr>
+          <w:p>
+            <w:pPr>
+              <w:pStyle w:val="Compact"/>
+              <w:jc w:val="center"/>
+            </w:pPr>
+            <w:r>
+              <w:rPr>
+                <w:b/>
+                <w:bCs/>
+              </w:rPr>
+              <w:t>95% interval</w:t>
+            </w:r>
+          </w:p>
+        </w:tc>
+        <w:tc>
+          <w:tcPr>
+            <w:tcW w:w="0" w:type="auto"/>
+          </w:tcPr>
+          <w:p>
+            <w:pPr>
+              <w:pStyle w:val="Compact"/>
+              <w:jc w:val="center"/>
+            </w:pPr>
+            <w:r>
+              <w:rPr>
+                <w:b/>
+                <w:bCs/>
+              </w:rPr>
+              <w:t>p</w:t>
+            </w:r>
+          </w:p>
+        </w:tc>
+      </w:tr>
+      <w:tr>
+        <w:tc>
+          <w:tcPr>
+            <w:tcW w:w="0" w:type="auto"/>
+          </w:tcPr>
+          <w:p>
+            <w:pPr>
+              <w:pStyle w:val="Compact"/>
+            </w:pPr>
+            <w:r>
+              <w:rPr>
+                <w:i/>
+                <w:iCs/>
+              </w:rPr>
+              <w:t>The request alone (history fixed)</w:t>
+            </w:r>
+          </w:p>
+        </w:tc>
+        <w:tc>
+          <w:tcPr>
+            <w:tcW w:w="0" w:type="auto"/>
+          </w:tcPr>
+          <w:p>
+            <w:pPr>
+              <w:pStyle w:val="Compact"/>
+              <w:jc w:val="center"/>
+            </w:pPr>
+          </w:p>
+        </w:tc>
+        <w:tc>
+          <w:tcPr>
+            <w:tcW w:w="0" w:type="auto"/>
+          </w:tcPr>
+          <w:p>
+            <w:pPr>
+              <w:pStyle w:val="Compact"/>
+              <w:jc w:val="center"/>
+            </w:pPr>
+          </w:p>
+        </w:tc>
+        <w:tc>
+          <w:tcPr>
+            <w:tcW w:w="0" w:type="auto"/>
+          </w:tcPr>
+          <w:p>
+            <w:pPr>
+              <w:pStyle w:val="Compact"/>
+              <w:jc w:val="center"/>
+            </w:pPr>
+          </w:p>
+        </w:tc>
+      </w:tr>
+      <w:tr>
+        <w:tc>
+          <w:tcPr>
+            <w:tcW w:w="0" w:type="auto"/>
+          </w:tcPr>
+          <w:p>
+            <w:pPr>
+              <w:pStyle w:val="Compact"/>
+            </w:pPr>
+            <w:r>
+              <w:t>Loss vs neutral</w:t>
+            </w:r>
+          </w:p>
+        </w:tc>
+        <w:tc>
+          <w:tcPr>
+            <w:tcW w:w="0" w:type="auto"/>
+          </w:tcPr>
+          <w:p>
+            <w:pPr>
+              <w:pStyle w:val="Compact"/>
+              <w:jc w:val="center"/>
+            </w:pPr>
+            <w:r>
+              <w:t>+5.6</w:t>
+            </w:r>
+          </w:p>
+        </w:tc>
+        <w:tc>
+          <w:tcPr>
+            <w:tcW w:w="0" w:type="auto"/>
+          </w:tcPr>
+          <w:p>
+            <w:pPr>
+              <w:pStyle w:val="Compact"/>
+              <w:jc w:val="center"/>
+            </w:pPr>
+            <w:r>
+              <w:t>+3.7 to +7.5</w:t>
+            </w:r>
+          </w:p>
+        </w:tc>
+        <w:tc>
+          <w:tcPr>
+            <w:tcW w:w="0" w:type="auto"/>
+          </w:tcPr>
+          <w:p>
+            <w:pPr>
+              <w:pStyle w:val="Compact"/>
+              <w:jc w:val="center"/>
+            </w:pPr>
+            <w:r>
+              <w:t>&lt;0.001</w:t>
+            </w:r>
+          </w:p>
+        </w:tc>
+      </w:tr>
+      <w:tr>
+        <w:tc>
+          <w:tcPr>
+            <w:tcW w:w="0" w:type="auto"/>
+          </w:tcPr>
+          <w:p>
+            <w:pPr>
+              <w:pStyle w:val="Compact"/>
+            </w:pPr>
+            <w:r>
+              <w:t>Loss + you vs neutral</w:t>
+            </w:r>
+          </w:p>
+        </w:tc>
+        <w:tc>
+          <w:tcPr>
+            <w:tcW w:w="0" w:type="auto"/>
+          </w:tcPr>
+          <w:p>
+            <w:pPr>
+              <w:pStyle w:val="Compact"/>
+              <w:jc w:val="center"/>
+            </w:pPr>
+            <w:r>
+              <w:t>+6.9</w:t>
+            </w:r>
+          </w:p>
+        </w:tc>
+        <w:tc>
+          <w:tcPr>
+            <w:tcW w:w="0" w:type="auto"/>
+          </w:tcPr>
+          <w:p>
+            <w:pPr>
+              <w:pStyle w:val="Compact"/>
+              <w:jc w:val="center"/>
+            </w:pPr>
+            <w:r>
+              <w:t>+4.2 to +9.7</w:t>
+            </w:r>
+          </w:p>
+        </w:tc>
+        <w:tc>
+          <w:tcPr>
+            <w:tcW w:w="0" w:type="auto"/>
+          </w:tcPr>
+          <w:p>
+            <w:pPr>
+              <w:pStyle w:val="Compact"/>
+              <w:jc w:val="center"/>
+            </w:pPr>
+            <w:r>
+              <w:t>&lt;0.001</w:t>
+            </w:r>
+          </w:p>
+        </w:tc>
+      </w:tr>
+      <w:tr>
+        <w:tc>
+          <w:tcPr>
+            <w:tcW w:w="0" w:type="auto"/>
+          </w:tcPr>
+          <w:p>
+            <w:pPr>
+              <w:pStyle w:val="Compact"/>
+            </w:pPr>
+            <w:r>
+              <w:lastRenderedPageBreak/>
+              <w:t>Gain vs neutral</w:t>
+            </w:r>
+          </w:p>
+        </w:tc>
+        <w:tc>
+          <w:tcPr>
+            <w:tcW w:w="0" w:type="auto"/>
+          </w:tcPr>
+          <w:p>
+            <w:pPr>
+              <w:pStyle w:val="Compact"/>
+              <w:jc w:val="center"/>
+            </w:pPr>
+            <w:r>
+              <w:t>+3.8</w:t>
+            </w:r>
+          </w:p>
+        </w:tc>
+        <w:tc>
+          <w:tcPr>
+            <w:tcW w:w="0" w:type="auto"/>
+          </w:tcPr>
+          <w:p>
+            <w:pPr>
+              <w:pStyle w:val="Compact"/>
+              <w:jc w:val="center"/>
+            </w:pPr>
+            <w:r>
+              <w:t>+1.8 to +5.8</w:t>
+            </w:r>
+          </w:p>
+        </w:tc>
+        <w:tc>
+          <w:tcPr>
+            <w:tcW w:w="0" w:type="auto"/>
+          </w:tcPr>
+          <w:p>
+            <w:pPr>
+              <w:pStyle w:val="Compact"/>
+              <w:jc w:val="center"/>
+            </w:pPr>
+            <w:r>
+              <w:t>0.001</w:t>
+            </w:r>
+          </w:p>
+        </w:tc>
+      </w:tr>
+      <w:tr>
+        <w:tc>
+          <w:tcPr>
+            <w:tcW w:w="0" w:type="auto"/>
+          </w:tcPr>
+          <w:p>
+            <w:pPr>
+              <w:pStyle w:val="Compact"/>
+            </w:pPr>
+            <w:r>
+              <w:t>Gain + you vs neutral</w:t>
+            </w:r>
+          </w:p>
+        </w:tc>
+        <w:tc>
+          <w:tcPr>
+            <w:tcW w:w="0" w:type="auto"/>
+          </w:tcPr>
+          <w:p>
+            <w:pPr>
+              <w:pStyle w:val="Compact"/>
+              <w:jc w:val="center"/>
+            </w:pPr>
+            <w:r>
+              <w:t>+4.6</w:t>
+            </w:r>
+          </w:p>
+        </w:tc>
+        <w:tc>
+          <w:tcPr>
+            <w:tcW w:w="0" w:type="auto"/>
+          </w:tcPr>
+          <w:p>
+            <w:pPr>
+              <w:pStyle w:val="Compact"/>
+              <w:jc w:val="center"/>
+            </w:pPr>
+            <w:r>
+              <w:t>+2.6 to +6.8</w:t>
+            </w:r>
+          </w:p>
+        </w:tc>
+        <w:tc>
+          <w:tcPr>
+            <w:tcW w:w="0" w:type="auto"/>
+          </w:tcPr>
+          <w:p>
+            <w:pPr>
+              <w:pStyle w:val="Compact"/>
+              <w:jc w:val="center"/>
+            </w:pPr>
+            <w:r>
+              <w:t>&lt;0.001</w:t>
+            </w:r>
+          </w:p>
+        </w:tc>
+      </w:tr>
+      <w:tr>
+        <w:tc>
+          <w:tcPr>
+            <w:tcW w:w="0" w:type="auto"/>
+          </w:tcPr>
+          <w:p>
+            <w:pPr>
+              <w:pStyle w:val="Compact"/>
+            </w:pPr>
+            <w:r>
+              <w:t>Loss vs gain</w:t>
+            </w:r>
+          </w:p>
+        </w:tc>
+        <w:tc>
+          <w:tcPr>
+            <w:tcW w:w="0" w:type="auto"/>
+          </w:tcPr>
+          <w:p>
+            <w:pPr>
+              <w:pStyle w:val="Compact"/>
+              <w:jc w:val="center"/>
+            </w:pPr>
+            <w:r>
+              <w:t>+2.0</w:t>
+            </w:r>
+          </w:p>
+        </w:tc>
+        <w:tc>
+          <w:tcPr>
+            <w:tcW w:w="0" w:type="auto"/>
+          </w:tcPr>
+          <w:p>
+            <w:pPr>
+              <w:pStyle w:val="Compact"/>
+              <w:jc w:val="center"/>
+            </w:pPr>
+            <w:r>
+              <w:t>+1.0 to +3.1</w:t>
+            </w:r>
+          </w:p>
+        </w:tc>
+        <w:tc>
+          <w:tcPr>
+            <w:tcW w:w="0" w:type="auto"/>
+          </w:tcPr>
+          <w:p>
+            <w:pPr>
+              <w:pStyle w:val="Compact"/>
+              <w:jc w:val="center"/>
+            </w:pPr>
+            <w:r>
+              <w:t>&lt;0.001</w:t>
+            </w:r>
+          </w:p>
+        </w:tc>
+      </w:tr>
+      <w:tr>
+        <w:tc>
+          <w:tcPr>
+            <w:tcW w:w="0" w:type="auto"/>
+          </w:tcPr>
+          <w:p>
+            <w:pPr>
+              <w:pStyle w:val="Compact"/>
+            </w:pPr>
+            <w:r>
+              <w:t>“You” vs none</w:t>
+            </w:r>
+          </w:p>
+        </w:tc>
+        <w:tc>
+          <w:tcPr>
+            <w:tcW w:w="0" w:type="auto"/>
+          </w:tcPr>
+          <w:p>
+            <w:pPr>
+              <w:pStyle w:val="Compact"/>
+              <w:jc w:val="center"/>
+            </w:pPr>
+            <w:r>
+              <w:t>+1.1</w:t>
+            </w:r>
+          </w:p>
+        </w:tc>
+        <w:tc>
+          <w:tcPr>
+            <w:tcW w:w="0" w:type="auto"/>
+          </w:tcPr>
+          <w:p>
+            <w:pPr>
+              <w:pStyle w:val="Compact"/>
+              <w:jc w:val="center"/>
+            </w:pPr>
+            <w:r>
+              <w:t>−0.4 to +2.6</w:t>
+            </w:r>
+          </w:p>
+        </w:tc>
+        <w:tc>
+          <w:tcPr>
+            <w:tcW w:w="0" w:type="auto"/>
+          </w:tcPr>
+          <w:p>
+            <w:pPr>
+              <w:pStyle w:val="Compact"/>
+              <w:jc w:val="center"/>
+            </w:pPr>
+            <w:r>
+              <w:t>0.16</w:t>
+            </w:r>
+          </w:p>
+        </w:tc>
+      </w:tr>
+      <w:tr>
+        <w:tc>
+          <w:tcPr>
+            <w:tcW w:w="0" w:type="auto"/>
+          </w:tcPr>
+          <w:p>
+            <w:pPr>
+              <w:pStyle w:val="Compact"/>
+            </w:pPr>
+            <w:r>
+              <w:t>Bank C's line</w:t>
+            </w:r>
+          </w:p>
+        </w:tc>
+        <w:tc>
+          <w:tcPr>
+            <w:tcW w:w="0" w:type="auto"/>
+          </w:tcPr>
+          <w:p>
+            <w:pPr>
+              <w:pStyle w:val="Compact"/>
+              <w:jc w:val="center"/>
+            </w:pPr>
+            <w:r>
+              <w:t>+4.0</w:t>
+            </w:r>
+          </w:p>
+        </w:tc>
+        <w:tc>
+          <w:tcPr>
+            <w:tcW w:w="0" w:type="auto"/>
+          </w:tcPr>
+          <w:p>
+            <w:pPr>
+              <w:pStyle w:val="Compact"/>
+              <w:jc w:val="center"/>
+            </w:pPr>
+            <w:r>
+              <w:t>+2.7 to +5.3</w:t>
+            </w:r>
+          </w:p>
+        </w:tc>
+        <w:tc>
+          <w:tcPr>
+            <w:tcW w:w="0" w:type="auto"/>
+          </w:tcPr>
+          <w:p>
+            <w:pPr>
+              <w:pStyle w:val="Compact"/>
+              <w:jc w:val="center"/>
+            </w:pPr>
+            <w:r>
+              <w:t>&lt;0.001</w:t>
+            </w:r>
+          </w:p>
+        </w:tc>
+      </w:tr>
+      <w:tr>
+        <w:tc>
+          <w:tcPr>
+            <w:tcW w:w="0" w:type="auto"/>
+          </w:tcPr>
+          <w:p>
+            <w:pPr>
+              <w:pStyle w:val="Compact"/>
+            </w:pPr>
+            <w:r>
+              <w:t>“You” after loss, with Bank C</w:t>
+            </w:r>
+          </w:p>
+        </w:tc>
+        <w:tc>
+          <w:tcPr>
+            <w:tcW w:w="0" w:type="auto"/>
+          </w:tcPr>
+          <w:p>
+            <w:pPr>
+              <w:pStyle w:val="Compact"/>
+              <w:jc w:val="center"/>
+            </w:pPr>
+            <w:r>
+              <w:t>+4.1</w:t>
+            </w:r>
+          </w:p>
+        </w:tc>
+        <w:tc>
+          <w:tcPr>
+            <w:tcW w:w="0" w:type="auto"/>
+          </w:tcPr>
+          <w:p>
+            <w:pPr>
+              <w:pStyle w:val="Compact"/>
+              <w:jc w:val="center"/>
+            </w:pPr>
+            <w:r>
+              <w:t>+2.3 to +5.9</w:t>
+            </w:r>
+          </w:p>
+        </w:tc>
+        <w:tc>
+          <w:tcPr>
+            <w:tcW w:w="0" w:type="auto"/>
+          </w:tcPr>
+          <w:p>
+            <w:pPr>
+              <w:pStyle w:val="Compact"/>
+              <w:jc w:val="center"/>
+            </w:pPr>
+            <w:r>
+              <w:t>&lt;0.001</w:t>
+            </w:r>
+          </w:p>
+        </w:tc>
+      </w:tr>
+      <w:tr>
+        <w:tc>
+          <w:tcPr>
+            <w:tcW w:w="0" w:type="auto"/>
+          </w:tcPr>
+          <w:p>
+            <w:pPr>
+              <w:pStyle w:val="Compact"/>
+            </w:pPr>
+            <w:r>
+              <w:t>“You” after gain, with Bank C</w:t>
+            </w:r>
+          </w:p>
+        </w:tc>
+        <w:tc>
+          <w:tcPr>
+            <w:tcW w:w="0" w:type="auto"/>
+          </w:tcPr>
+          <w:p>
+            <w:pPr>
+              <w:pStyle w:val="Compact"/>
+              <w:jc w:val="center"/>
+            </w:pPr>
+            <w:r>
+              <w:t>+2.2</w:t>
+            </w:r>
+          </w:p>
+        </w:tc>
+        <w:tc>
+          <w:tcPr>
+            <w:tcW w:w="0" w:type="auto"/>
+          </w:tcPr>
+          <w:p>
+            <w:pPr>
+              <w:pStyle w:val="Compact"/>
+              <w:jc w:val="center"/>
+            </w:pPr>
+            <w:r>
+              <w:t>+0.8 to +3.7</w:t>
+            </w:r>
+          </w:p>
+        </w:tc>
+        <w:tc>
+          <w:tcPr>
+            <w:tcW w:w="0" w:type="auto"/>
+          </w:tcPr>
+          <w:p>
+            <w:pPr>
+              <w:pStyle w:val="Compact"/>
+              <w:jc w:val="center"/>
+            </w:pPr>
+            <w:r>
+              <w:t>0.002</w:t>
+            </w:r>
+          </w:p>
+        </w:tc>
+      </w:tr>
+      <w:tr>
+        <w:tc>
+          <w:tcPr>
+            <w:tcW w:w="0" w:type="auto"/>
+          </w:tcPr>
+          <w:p>
+            <w:pPr>
+              <w:pStyle w:val="Compact"/>
+            </w:pPr>
+            <w:r>
+              <w:rPr>
+                <w:i/>
+                <w:iCs/>
+              </w:rPr>
+              <w:t>The history (request held neutral)</w:t>
+            </w:r>
+          </w:p>
+        </w:tc>
+        <w:tc>
+          <w:tcPr>
+            <w:tcW w:w="0" w:type="auto"/>
+          </w:tcPr>
+          <w:p>
+            <w:pPr>
+              <w:pStyle w:val="Compact"/>
+              <w:jc w:val="center"/>
+            </w:pPr>
+          </w:p>
+        </w:tc>
+        <w:tc>
+          <w:tcPr>
+            <w:tcW w:w="0" w:type="auto"/>
+          </w:tcPr>
+          <w:p>
+            <w:pPr>
+              <w:pStyle w:val="Compact"/>
+              <w:jc w:val="center"/>
+            </w:pPr>
+          </w:p>
+        </w:tc>
+        <w:tc>
+          <w:tcPr>
+            <w:tcW w:w="0" w:type="auto"/>
+          </w:tcPr>
+          <w:p>
+            <w:pPr>
+              <w:pStyle w:val="Compact"/>
+              <w:jc w:val="center"/>
+            </w:pPr>
+          </w:p>
+        </w:tc>
+      </w:tr>
+      <w:tr>
+        <w:tc>
+          <w:tcPr>
+            <w:tcW w:w="0" w:type="auto"/>
+          </w:tcPr>
+          <w:p>
+            <w:pPr>
+              <w:pStyle w:val="Compact"/>
+            </w:pPr>
+            <w:r>
+              <w:t>Framed vs neutral history</w:t>
+            </w:r>
+          </w:p>
+        </w:tc>
+        <w:tc>
+          <w:tcPr>
+            <w:tcW w:w="0" w:type="auto"/>
+          </w:tcPr>
+          <w:p>
+            <w:pPr>
+              <w:pStyle w:val="Compact"/>
+              <w:jc w:val="center"/>
+            </w:pPr>
+            <w:r>
+              <w:t>+18.5</w:t>
+            </w:r>
+          </w:p>
+        </w:tc>
+        <w:tc>
+          <w:tcPr>
+            <w:tcW w:w="0" w:type="auto"/>
+          </w:tcPr>
+          <w:p>
+            <w:pPr>
+              <w:pStyle w:val="Compact"/>
+              <w:jc w:val="center"/>
+            </w:pPr>
+            <w:r>
+              <w:t>+10.6 to +26.1</w:t>
+            </w:r>
+          </w:p>
+        </w:tc>
+        <w:tc>
+          <w:tcPr>
+            <w:tcW w:w="0" w:type="auto"/>
+          </w:tcPr>
+          <w:p>
+            <w:pPr>
+              <w:pStyle w:val="Compact"/>
+              <w:jc w:val="center"/>
+            </w:pPr>
+            <w:r>
+              <w:t>0.001</w:t>
+            </w:r>
+          </w:p>
+        </w:tc>
+      </w:tr>
+      <w:tr>
+        <w:tc>
+          <w:tcPr>
+            <w:tcW w:w="0" w:type="auto"/>
+          </w:tcPr>
+          <w:p>
+            <w:pPr>
+              <w:pStyle w:val="Compact"/>
+            </w:pPr>
+            <w:r>
+              <w:t>Loss vs gain history</w:t>
+            </w:r>
+          </w:p>
+        </w:tc>
+        <w:tc>
+          <w:tcPr>
+            <w:tcW w:w="0" w:type="auto"/>
+          </w:tcPr>
+          <w:p>
+            <w:pPr>
+              <w:pStyle w:val="Compact"/>
+              <w:jc w:val="center"/>
+            </w:pPr>
+            <w:r>
+              <w:t>+5.4</w:t>
+            </w:r>
+          </w:p>
+        </w:tc>
+        <w:tc>
+          <w:tcPr>
+            <w:tcW w:w="0" w:type="auto"/>
+          </w:tcPr>
+          <w:p>
+            <w:pPr>
+              <w:pStyle w:val="Compact"/>
+              <w:jc w:val="center"/>
+            </w:pPr>
+            <w:r>
+              <w:t>−3.7 to +15.2</w:t>
+            </w:r>
+          </w:p>
+        </w:tc>
+        <w:tc>
+          <w:tcPr>
+            <w:tcW w:w="0" w:type="auto"/>
+          </w:tcPr>
+          <w:p>
+            <w:pPr>
+              <w:pStyle w:val="Compact"/>
+              <w:jc w:val="center"/>
+            </w:pPr>
+            <w:r>
+              <w:t>0.30</w:t>
+            </w:r>
+          </w:p>
+        </w:tc>
+      </w:tr>
+      <w:tr>
+        <w:tc>
+          <w:tcPr>
+            <w:tcW w:w="0" w:type="auto"/>
+          </w:tcPr>
+          <w:p>
+            <w:pPr>
+              <w:pStyle w:val="Compact"/>
+            </w:pPr>
+            <w:r>
+              <w:rPr>
+                <w:i/>
+                <w:iCs/>
+              </w:rPr>
+              <w:t>History and request together (as saved)</w:t>
+            </w:r>
+          </w:p>
+        </w:tc>
+        <w:tc>
+          <w:tcPr>
+            <w:tcW w:w="0" w:type="auto"/>
+          </w:tcPr>
+          <w:p>
+            <w:pPr>
+              <w:pStyle w:val="Compact"/>
+              <w:jc w:val="center"/>
+            </w:pPr>
+          </w:p>
+        </w:tc>
+        <w:tc>
+          <w:tcPr>
+            <w:tcW w:w="0" w:type="auto"/>
+          </w:tcPr>
+          <w:p>
+            <w:pPr>
+              <w:pStyle w:val="Compact"/>
+              <w:jc w:val="center"/>
+            </w:pPr>
+          </w:p>
+        </w:tc>
+        <w:tc>
+          <w:tcPr>
+            <w:tcW w:w="0" w:type="auto"/>
+          </w:tcPr>
+          <w:p>
+            <w:pPr>
+              <w:pStyle w:val="Compact"/>
+              <w:jc w:val="center"/>
+            </w:pPr>
+          </w:p>
+        </w:tc>
+      </w:tr>
+      <w:tr>
+        <w:tc>
+          <w:tcPr>
+            <w:tcW w:w="0" w:type="auto"/>
+          </w:tcPr>
+          <w:p>
+            <w:pPr>
+              <w:pStyle w:val="Compact"/>
+            </w:pPr>
+            <w:r>
+              <w:t>Framed vs neutral</w:t>
+            </w:r>
+          </w:p>
+        </w:tc>
+        <w:tc>
+          <w:tcPr>
+            <w:tcW w:w="0" w:type="auto"/>
+          </w:tcPr>
+          <w:p>
+            <w:pPr>
+              <w:pStyle w:val="Compact"/>
+              <w:jc w:val="center"/>
+            </w:pPr>
+            <w:r>
+              <w:t>+23.3</w:t>
+            </w:r>
+          </w:p>
+        </w:tc>
+        <w:tc>
+          <w:tcPr>
+            <w:tcW w:w="0" w:type="auto"/>
+          </w:tcPr>
+          <w:p>
+            <w:pPr>
+              <w:pStyle w:val="Compact"/>
+              <w:jc w:val="center"/>
+            </w:pPr>
+            <w:r>
+              <w:t>+15.0 to +31.4</w:t>
+            </w:r>
+          </w:p>
+        </w:tc>
+        <w:tc>
+          <w:tcPr>
+            <w:tcW w:w="0" w:type="auto"/>
+          </w:tcPr>
+          <w:p>
+            <w:pPr>
+              <w:pStyle w:val="Compact"/>
+              <w:jc w:val="center"/>
+            </w:pPr>
+            <w:r>
+              <w:t>&lt;0.001</w:t>
+            </w:r>
+          </w:p>
+        </w:tc>
+      </w:tr>
+      <w:tr>
+        <w:tc>
+          <w:tcPr>
+            <w:tcW w:w="0" w:type="auto"/>
+          </w:tcPr>
+          <w:p>
+            <w:pPr>
+              <w:pStyle w:val="Compact"/>
+            </w:pPr>
+            <w:r>
+              <w:t>Loss vs gain</w:t>
+            </w:r>
+          </w:p>
+        </w:tc>
+        <w:tc>
+          <w:tcPr>
+            <w:tcW w:w="0" w:type="auto"/>
+          </w:tcPr>
+          <w:p>
+            <w:pPr>
+              <w:pStyle w:val="Compact"/>
+              <w:jc w:val="center"/>
+            </w:pPr>
+            <w:r>
+              <w:t>+7.0</w:t>
+            </w:r>
+          </w:p>
+        </w:tc>
+        <w:tc>
+          <w:tcPr>
+            <w:tcW w:w="0" w:type="auto"/>
+          </w:tcPr>
+          <w:p>
+            <w:pPr>
+              <w:pStyle w:val="Compact"/>
+              <w:jc w:val="center"/>
+            </w:pPr>
+            <w:r>
+              <w:t>−2.4 to +17.1</w:t>
+            </w:r>
+          </w:p>
+        </w:tc>
+        <w:tc>
+          <w:tcPr>
+            <w:tcW w:w="0" w:type="auto"/>
+          </w:tcPr>
+          <w:p>
+            <w:pPr>
+              <w:pStyle w:val="Compact"/>
+              <w:jc w:val="center"/>
+            </w:pPr>
+            <w:r>
+              <w:t>0.18</w:t>
+            </w:r>
+          </w:p>
+        </w:tc>
+      </w:tr>
+    </w:tbl>
+    <w:p>
+      <w:pPr>
+        <w:pStyle w:val="BodyText"/>
+      </w:pPr>
+      <w:r>
+        <w:rPr>
+          <w:b/>
+          <w:bCs/>
+        </w:rPr>
+        <w:t>About four-fifths of the framing's effect comes from the conversation before the request, not from the request itself.</w:t>
+      </w:r>
+      <w:r>
+        <w:t xml:space="preserve"> Swapping only UBS's current request moved the probability of an order that goes along by a few points (Table 12): loss framing by 5.6 points over the neutral request and loss + you by 6.9, gain by 3.8 and gain + you by 4.6, all with intervals above zero; loss exceeded gain by 2.0 points. Holding the request neutral and comparing careers instead, framed histories raised the same probability by 18.5 points over neutral ones (</w:t>
       </w:r>
       <w:r>
         <w:rPr>
@@ -8070,7 +9760,22 @@
         <w:t>p</w:t>
       </w:r>
       <w:r>
-        <w:t xml:space="preserve"> = 0.017). A random direction of the same size lowered it too, to 15% (</w:t>
+        <w:t xml:space="preserve"> = 0.001), against 23.3 points for history and request together. About four-fifths of the framing's effect on the decision is therefore carried by the history: UBS's earlier framed lines and the agent's own replies and trades that followed them, which this reread does not separate. The probability is read after a fixed neutral reasoning line, so its levels (14% for a neutral career and request) differ from the sampled rates, and the orders scored cover a median of 67% of the model's probability; the comparisons are what it measures. The rereads reproduce the original states exactly (median cosine 1.000 at every layer).</w:t>
+      </w:r>
+    </w:p>
+    <w:p>
+      <w:pPr>
+        <w:pStyle w:val="BodyText"/>
+      </w:pPr>
+      <w:r>
+        <w:rPr>
+          <w:b/>
+          <w:bCs/>
+        </w:rPr>
+        <w:t>The framed request acts at the first request; the framed history acts at the second and fades by June.</w:t>
+      </w:r>
+      <w:r>
+        <w:t xml:space="preserve"> Split by request (exploratory; ten careers per version), the two parts take turns. At the first request (7 January) the effect is the request's own: its framing raised the probability of an order that goes along by 26 points (</w:t>
       </w:r>
       <w:r>
         <w:rPr>
@@ -8080,7 +9785,7 @@
         <w:t>p</w:t>
       </w:r>
       <w:r>
-        <w:t xml:space="preserve"> = 0.34), and so did the memo direction (9%; </w:t>
+        <w:t xml:space="preserve"> &lt; 0.001), and the history added nothing. At the second (12 January) it is all history: framed histories raised the probability by 60 points (</w:t>
       </w:r>
       <w:r>
         <w:rPr>
@@ -8090,7 +9795,7 @@
         <w:t>p</w:t>
       </w:r>
       <w:r>
-        <w:t xml:space="preserve"> = 0.049), which also made more replies unreadable. Subtracting the direction from loss + you agents lowered going along from 73% to 53% (</w:t>
+        <w:t xml:space="preserve"> &lt; 0.001), and the request's framing added nothing. The history still pulled on 1 April (49 points, </w:t>
       </w:r>
       <w:r>
         <w:rPr>
@@ -8100,7 +9805,22 @@
         <w:t>p</w:t>
       </w:r>
       <w:r>
-        <w:t xml:space="preserve"> = 0.07), while subtracting the random direction raised it to 84% (</w:t>
+        <w:t xml:space="preserve"> = 0.001), although the real agents, reasoning in their own words, almost never went along there (2%); by June and August neither part moved the decision. Inside, the framed history's push along the frame direction at layer 12 was largest at the first request and fell to between 0.09 and 0.38 of that by June and August. The push is delivered early and carried for a while by the history, which by 12 January includes the agent's own first trades, rather than built up.</w:t>
+      </w:r>
+    </w:p>
+    <w:p>
+      <w:pPr>
+        <w:pStyle w:val="BodyText"/>
+      </w:pPr>
+      <w:r>
+        <w:rPr>
+          <w:b/>
+          <w:bCs/>
+        </w:rPr>
+        <w:t>Placing the outcome on the agent (“you”) changes its internal state more after a loss than after a gain.</w:t>
+      </w:r>
+      <w:r>
+        <w:t xml:space="preserve"> With the history fixed, “you” alone did not move the decision (+1.1 points, </w:t>
       </w:r>
       <w:r>
         <w:rPr>
@@ -8110,7 +9830,7 @@
         <w:t>p</w:t>
       </w:r>
       <w:r>
-        <w:t xml:space="preserve"> = 0.06). Replacing the agent’s earlier reasoning with neutral sentences changed nothing significant. An audit of the code and analysis, with each finding checked independently, identified faults that limit what this run can show: the step size was measured on the same careers that built the direction, so the pushes were larger than stated; a single random direction cannot serve as a null; each sign was applied in only one group; and the log-probability measure of the order omitted orders written with a “+” sign and counted shorter orders inside longer ones. The run neither shows nor rules out that the represented framing causes going along.</w:t>
+        <w:t xml:space="preserve"> = 0.16), but with Bank C's line it added 4.1 points after loss and 2.2 after gain, as in Experiment F. Inside, the change “you” makes to the state is 27% to 39% larger after loss than after gain at layers 18 and 31 to 47, and the two changes are alike but not the same: their cosine is 0.71 to 0.92 at layers 12 to 47, against 0.98 to 1.00 for the change after loss compared with itself on two halves of the careers. Because the loss + you and gain + you lines are written separately, part of this difference may lie in their words.</w:t>
       </w:r>
     </w:p>
     <w:p>
@@ -8122,17 +9842,1298 @@
           <w:b/>
           <w:bCs/>
         </w:rPr>
-        <w:t>[Note:</w:t>
-      </w:r>
-      <w:r>
-        <w:t xml:space="preserve"> </w:t>
+        <w:t>Bank C's endorsement moves the model's internal state in the same direction as a loss frame.</w:t>
+      </w:r>
+      <w:r>
+        <w:t xml:space="preserve"> With the history fixed, Bank C's line moves the state along the loss-frame direction about as far as the loss frame itself at layer 12 (0.91 of the loss–neutral gap) and about twice as far at layer 24 (1.95).</w:t>
+      </w:r>
+    </w:p>
+    <w:p>
+      <w:pPr>
+        <w:pStyle w:val="BodyText"/>
+      </w:pPr>
+      <w:r>
+        <w:rPr>
+          <w:b/>
+          <w:bCs/>
+        </w:rPr>
+        <w:lastRenderedPageBreak/>
+        <w:t>Management's memo makes the agent trade more but does not make it join UBS, even with everything else held fixed.</w:t>
+      </w:r>
+      <w:r>
+        <w:t xml:space="preserve"> In A's careers, swapping in management's memo and books raised the expected size of the agent's first order of the day by 50,000 ounces under loss and 32,000 under gain (loss above gain by 16,000; all </w:t>
       </w:r>
       <w:r>
         <w:rPr>
           <w:i/>
           <w:iCs/>
         </w:rPr>
-        <w:t>To be completed when the matched-history and transplant runs are in: (i) the framing’s immediate effect on the decision and the state at fixed history, for every significant behavioral effect (loss, loss + you, gain + you, and Bank C’s line); (ii) the history’s effect with the request held neutral; (iii) “you” after loss against “you” after gain; (iv) management’s priming at fixed history, and whether management’s loss and UBS’s loss share a direction; (v) the transplant, layer by layer; (vi) a second steering test with the matched direction at its natural size, against ten random directions.</w:t>
+        <w:t>p</w:t>
+      </w:r>
+      <w:r>
+        <w:t xml:space="preserve"> &lt; 0.001), and placing the outcome on the agent lowered it, by 11,600 ounces after loss and 8,200 after gain. The priming did not change the probability of going along at UBS's requests (every change within half a point, none significant). Inside, management's loss direction matches UBS's at layer 12 (cosine 0.72, against 0.88 between two halves of the careers) and departs from it from layer 31 on (−0.56 at layer 47): the two sources register alike early and lead to different behavior.</w:t>
+      </w:r>
+    </w:p>
+    <w:p>
+      <w:pPr>
+        <w:pStyle w:val="BodyText"/>
+      </w:pPr>
+      <w:r>
+        <w:rPr>
+          <w:b/>
+          <w:bCs/>
+        </w:rPr>
+        <w:t>The first steering test likely failed because its direction captured differences in history rather than in framing.</w:t>
+      </w:r>
+      <w:r>
+        <w:t xml:space="preserve"> At layer 24, where the first steering test pushed, the frame direction measured across careers points away from the direction the request itself produces with the history fixed (cosine −0.29); the two agree at layer 12 (0.98) and largely at layer 18 (0.82). The direction used in that test mostly carried differences in history rather than the request's framing.</w:t>
+      </w:r>
+    </w:p>
+    <w:p>
+      <w:pPr>
+        <w:pStyle w:val="Heading2"/>
+      </w:pPr>
+      <w:r>
+        <w:t>7.9 Steering at fixed history</w:t>
+      </w:r>
+    </w:p>
+    <w:p>
+      <w:pPr>
+        <w:pStyle w:val="BodyText"/>
+      </w:pPr>
+      <w:r>
+        <w:rPr>
+          <w:b/>
+          <w:bCs/>
+        </w:rPr>
+        <w:t>Adding the loss direction to the model's state does not reproduce the effect of loss framing.</w:t>
+      </w:r>
+      <w:r>
+        <w:t xml:space="preserve"> Added to neutral agents at twice its natural size, the loss direction measured at fixed history lowered the probability of an order that goes along by 4.0 points relative to random directions of the same size (Holm </w:t>
+      </w:r>
+      <w:r>
+        <w:rPr>
+          <w:i/>
+          <w:iCs/>
+        </w:rPr>
+        <w:t>p</w:t>
+      </w:r>
+      <w:r>
+        <w:t xml:space="preserve"> = 0.010; H1), and subtracting it from loss-framed agents raised it by 8.4 points (Holm </w:t>
+      </w:r>
+      <w:r>
+        <w:rPr>
+          <w:i/>
+          <w:iCs/>
+        </w:rPr>
+        <w:t>p</w:t>
+      </w:r>
+      <w:r>
+        <w:t xml:space="preserve"> = 0.003; H3); adding it lowered going along relative to subtracting it (−3.4 points, Holm </w:t>
+      </w:r>
+      <w:r>
+        <w:rPr>
+          <w:i/>
+          <w:iCs/>
+        </w:rPr>
+        <w:t>p</w:t>
+      </w:r>
+      <w:r>
+        <w:t xml:space="preserve"> = 0.029; H4). It did not change the size of the opening order (H2: +329 ounces, </w:t>
+      </w:r>
+      <w:r>
+        <w:rPr>
+          <w:i/>
+          <w:iCs/>
+        </w:rPr>
+        <w:t>p</w:t>
+      </w:r>
+      <w:r>
+        <w:t xml:space="preserve"> = 0.94). The significant tests run against the preregistered prediction, and the random directions themselves moved the probability, so the loss direction at the decision is best read as doing little: it does not carry the framing's effect.</w:t>
+      </w:r>
+    </w:p>
+    <w:p>
+      <w:pPr>
+        <w:pStyle w:val="BodyText"/>
+      </w:pPr>
+      <w:r>
+        <w:rPr>
+          <w:b/>
+          <w:bCs/>
+        </w:rPr>
+        <w:t>Adding a direction built from agents' own decisions to go along does make the agent go along more.</w:t>
+      </w:r>
+      <w:r>
+        <w:t xml:space="preserve"> The going-along direction at layer 24, pushed the same way, raised the probability of an order that goes along by 9.6 points over random directions (</w:t>
+      </w:r>
+      <w:r>
+        <w:rPr>
+          <w:i/>
+          <w:iCs/>
+        </w:rPr>
+        <w:t>p</w:t>
+      </w:r>
+      <w:r>
+        <w:t xml:space="preserve"> = 0.001), and subtracting it from loss-framed agents lowered it by 7.5 points (</w:t>
+      </w:r>
+      <w:r>
+        <w:rPr>
+          <w:i/>
+          <w:iCs/>
+        </w:rPr>
+        <w:t>p</w:t>
+      </w:r>
+      <w:r>
+        <w:t xml:space="preserve"> &lt; 0.001). Steering one layer can move this decision; the loss direction measured at the moment of the request does not. Together with Table 12, this places the framing's effect in what the conversation builds rather than in one direction at the decision. Further exploratory steering tests are in the repository.</w:t>
+      </w:r>
+    </w:p>
+    <w:p>
+      <w:pPr>
+        <w:pStyle w:val="Heading2"/>
+      </w:pPr>
+      <w:r>
+        <w:t>7.10 Does the agent know it is misconduct?</w:t>
+      </w:r>
+    </w:p>
+    <w:p>
+      <w:pPr>
+        <w:pStyle w:val="TableCaption"/>
+      </w:pPr>
+      <w:r>
+        <w:rPr>
+          <w:b/>
+          <w:bCs/>
+        </w:rPr>
+        <w:t>Table 13:</w:t>
+      </w:r>
+      <w:r>
+        <w:t xml:space="preserve"> Asked directly, at each of B's 300 saved requests: “is what UBS is asking you to do market manipulation?” The probability of Yes, with UBS's request in each framing at the same moment (the Yes and No answers take a median 1.00 of the model's probability). Changes in percentage points; </w:t>
+      </w:r>
+      <w:r>
+        <w:rPr>
+          <w:iCs/>
+        </w:rPr>
+        <w:t>p</w:t>
+      </w:r>
+      <w:r>
+        <w:t xml:space="preserve"> flips signs by career. Exploratory.</w:t>
+      </w:r>
+    </w:p>
+    <w:tbl>
+      <w:tblPr>
+        <w:tblStyle w:val="Table"/>
+        <w:tblW w:w="5000" w:type="pct"/>
+        <w:tblLook w:val="0020" w:firstRow="1" w:lastRow="0" w:firstColumn="0" w:lastColumn="0" w:noHBand="0" w:noVBand="0"/>
+      </w:tblPr>
+      <w:tblGrid>
+        <w:gridCol w:w="2158"/>
+        <w:gridCol w:w="1203"/>
+        <w:gridCol w:w="2680"/>
+        <w:gridCol w:w="2121"/>
+        <w:gridCol w:w="1198"/>
+      </w:tblGrid>
+      <w:tr>
+        <w:trPr>
+          <w:cnfStyle w:val="100000000000" w:firstRow="1" w:lastRow="0" w:firstColumn="0" w:lastColumn="0" w:oddVBand="0" w:evenVBand="0" w:oddHBand="0" w:evenHBand="0" w:firstRowFirstColumn="0" w:firstRowLastColumn="0" w:lastRowFirstColumn="0" w:lastRowLastColumn="0"/>
+          <w:tblHeader/>
+        </w:trPr>
+        <w:tc>
+          <w:tcPr>
+            <w:tcW w:w="0" w:type="auto"/>
+          </w:tcPr>
+          <w:p>
+            <w:pPr>
+              <w:pStyle w:val="Compact"/>
+            </w:pPr>
+            <w:r>
+              <w:rPr>
+                <w:b/>
+                <w:bCs/>
+              </w:rPr>
+              <w:t>UBS's request</w:t>
+            </w:r>
+          </w:p>
+        </w:tc>
+        <w:tc>
+          <w:tcPr>
+            <w:tcW w:w="0" w:type="auto"/>
+          </w:tcPr>
+          <w:p>
+            <w:pPr>
+              <w:pStyle w:val="Compact"/>
+              <w:jc w:val="center"/>
+            </w:pPr>
+            <w:r>
+              <w:rPr>
+                <w:b/>
+                <w:bCs/>
+              </w:rPr>
+              <w:t>P(Yes)</w:t>
+            </w:r>
+          </w:p>
+        </w:tc>
+        <w:tc>
+          <w:tcPr>
+            <w:tcW w:w="0" w:type="auto"/>
+          </w:tcPr>
+          <w:p>
+            <w:pPr>
+              <w:pStyle w:val="Compact"/>
+              <w:jc w:val="center"/>
+            </w:pPr>
+            <w:r>
+              <w:rPr>
+                <w:b/>
+                <w:bCs/>
+              </w:rPr>
+              <w:t>Change vs neutral</w:t>
+            </w:r>
+          </w:p>
+        </w:tc>
+        <w:tc>
+          <w:tcPr>
+            <w:tcW w:w="0" w:type="auto"/>
+          </w:tcPr>
+          <w:p>
+            <w:pPr>
+              <w:pStyle w:val="Compact"/>
+              <w:jc w:val="center"/>
+            </w:pPr>
+            <w:r>
+              <w:rPr>
+                <w:b/>
+                <w:bCs/>
+              </w:rPr>
+              <w:t>95% interval</w:t>
+            </w:r>
+          </w:p>
+        </w:tc>
+        <w:tc>
+          <w:tcPr>
+            <w:tcW w:w="0" w:type="auto"/>
+          </w:tcPr>
+          <w:p>
+            <w:pPr>
+              <w:pStyle w:val="Compact"/>
+              <w:jc w:val="center"/>
+            </w:pPr>
+            <w:r>
+              <w:rPr>
+                <w:b/>
+                <w:bCs/>
+              </w:rPr>
+              <w:t>p</w:t>
+            </w:r>
+          </w:p>
+        </w:tc>
+      </w:tr>
+      <w:tr>
+        <w:tc>
+          <w:tcPr>
+            <w:tcW w:w="0" w:type="auto"/>
+          </w:tcPr>
+          <w:p>
+            <w:pPr>
+              <w:pStyle w:val="Compact"/>
+            </w:pPr>
+            <w:r>
+              <w:t>Neutral</w:t>
+            </w:r>
+          </w:p>
+        </w:tc>
+        <w:tc>
+          <w:tcPr>
+            <w:tcW w:w="0" w:type="auto"/>
+          </w:tcPr>
+          <w:p>
+            <w:pPr>
+              <w:pStyle w:val="Compact"/>
+              <w:jc w:val="center"/>
+            </w:pPr>
+            <w:r>
+              <w:t>26.8%</w:t>
+            </w:r>
+          </w:p>
+        </w:tc>
+        <w:tc>
+          <w:tcPr>
+            <w:tcW w:w="0" w:type="auto"/>
+          </w:tcPr>
+          <w:p>
+            <w:pPr>
+              <w:pStyle w:val="Compact"/>
+              <w:jc w:val="center"/>
+            </w:pPr>
+            <w:r>
+              <w:t>–</w:t>
+            </w:r>
+          </w:p>
+        </w:tc>
+        <w:tc>
+          <w:tcPr>
+            <w:tcW w:w="0" w:type="auto"/>
+          </w:tcPr>
+          <w:p>
+            <w:pPr>
+              <w:pStyle w:val="Compact"/>
+              <w:jc w:val="center"/>
+            </w:pPr>
+            <w:r>
+              <w:t>–</w:t>
+            </w:r>
+          </w:p>
+        </w:tc>
+        <w:tc>
+          <w:tcPr>
+            <w:tcW w:w="0" w:type="auto"/>
+          </w:tcPr>
+          <w:p>
+            <w:pPr>
+              <w:pStyle w:val="Compact"/>
+              <w:jc w:val="center"/>
+            </w:pPr>
+            <w:r>
+              <w:t>–</w:t>
+            </w:r>
+          </w:p>
+        </w:tc>
+      </w:tr>
+      <w:tr>
+        <w:tc>
+          <w:tcPr>
+            <w:tcW w:w="0" w:type="auto"/>
+          </w:tcPr>
+          <w:p>
+            <w:pPr>
+              <w:pStyle w:val="Compact"/>
+            </w:pPr>
+            <w:r>
+              <w:t>Loss</w:t>
+            </w:r>
+          </w:p>
+        </w:tc>
+        <w:tc>
+          <w:tcPr>
+            <w:tcW w:w="0" w:type="auto"/>
+          </w:tcPr>
+          <w:p>
+            <w:pPr>
+              <w:pStyle w:val="Compact"/>
+              <w:jc w:val="center"/>
+            </w:pPr>
+            <w:r>
+              <w:t>12.1%</w:t>
+            </w:r>
+          </w:p>
+        </w:tc>
+        <w:tc>
+          <w:tcPr>
+            <w:tcW w:w="0" w:type="auto"/>
+          </w:tcPr>
+          <w:p>
+            <w:pPr>
+              <w:pStyle w:val="Compact"/>
+              <w:jc w:val="center"/>
+            </w:pPr>
+            <w:r>
+              <w:t>−14.7</w:t>
+            </w:r>
+          </w:p>
+        </w:tc>
+        <w:tc>
+          <w:tcPr>
+            <w:tcW w:w="0" w:type="auto"/>
+          </w:tcPr>
+          <w:p>
+            <w:pPr>
+              <w:pStyle w:val="Compact"/>
+              <w:jc w:val="center"/>
+            </w:pPr>
+            <w:r>
+              <w:t>−18.2 to −11.4</w:t>
+            </w:r>
+          </w:p>
+        </w:tc>
+        <w:tc>
+          <w:tcPr>
+            <w:tcW w:w="0" w:type="auto"/>
+          </w:tcPr>
+          <w:p>
+            <w:pPr>
+              <w:pStyle w:val="Compact"/>
+              <w:jc w:val="center"/>
+            </w:pPr>
+            <w:r>
+              <w:t>&lt;0.001</w:t>
+            </w:r>
+          </w:p>
+        </w:tc>
+      </w:tr>
+      <w:tr>
+        <w:tc>
+          <w:tcPr>
+            <w:tcW w:w="0" w:type="auto"/>
+          </w:tcPr>
+          <w:p>
+            <w:pPr>
+              <w:pStyle w:val="Compact"/>
+            </w:pPr>
+            <w:r>
+              <w:t>Gain</w:t>
+            </w:r>
+          </w:p>
+        </w:tc>
+        <w:tc>
+          <w:tcPr>
+            <w:tcW w:w="0" w:type="auto"/>
+          </w:tcPr>
+          <w:p>
+            <w:pPr>
+              <w:pStyle w:val="Compact"/>
+              <w:jc w:val="center"/>
+            </w:pPr>
+            <w:r>
+              <w:t>14.6%</w:t>
+            </w:r>
+          </w:p>
+        </w:tc>
+        <w:tc>
+          <w:tcPr>
+            <w:tcW w:w="0" w:type="auto"/>
+          </w:tcPr>
+          <w:p>
+            <w:pPr>
+              <w:pStyle w:val="Compact"/>
+              <w:jc w:val="center"/>
+            </w:pPr>
+            <w:r>
+              <w:t>−12.2</w:t>
+            </w:r>
+          </w:p>
+        </w:tc>
+        <w:tc>
+          <w:tcPr>
+            <w:tcW w:w="0" w:type="auto"/>
+          </w:tcPr>
+          <w:p>
+            <w:pPr>
+              <w:pStyle w:val="Compact"/>
+              <w:jc w:val="center"/>
+            </w:pPr>
+            <w:r>
+              <w:t>−15.2 to −9.4</w:t>
+            </w:r>
+          </w:p>
+        </w:tc>
+        <w:tc>
+          <w:tcPr>
+            <w:tcW w:w="0" w:type="auto"/>
+          </w:tcPr>
+          <w:p>
+            <w:pPr>
+              <w:pStyle w:val="Compact"/>
+              <w:jc w:val="center"/>
+            </w:pPr>
+            <w:r>
+              <w:t>&lt;0.001</w:t>
+            </w:r>
+          </w:p>
+        </w:tc>
+      </w:tr>
+      <w:tr>
+        <w:tc>
+          <w:tcPr>
+            <w:tcW w:w="0" w:type="auto"/>
+          </w:tcPr>
+          <w:p>
+            <w:pPr>
+              <w:pStyle w:val="Compact"/>
+            </w:pPr>
+            <w:r>
+              <w:t>Loss + you</w:t>
+            </w:r>
+          </w:p>
+        </w:tc>
+        <w:tc>
+          <w:tcPr>
+            <w:tcW w:w="0" w:type="auto"/>
+          </w:tcPr>
+          <w:p>
+            <w:pPr>
+              <w:pStyle w:val="Compact"/>
+              <w:jc w:val="center"/>
+            </w:pPr>
+            <w:r>
+              <w:t>13.1%</w:t>
+            </w:r>
+          </w:p>
+        </w:tc>
+        <w:tc>
+          <w:tcPr>
+            <w:tcW w:w="0" w:type="auto"/>
+          </w:tcPr>
+          <w:p>
+            <w:pPr>
+              <w:pStyle w:val="Compact"/>
+              <w:jc w:val="center"/>
+            </w:pPr>
+            <w:r>
+              <w:t>−13.6</w:t>
+            </w:r>
+          </w:p>
+        </w:tc>
+        <w:tc>
+          <w:tcPr>
+            <w:tcW w:w="0" w:type="auto"/>
+          </w:tcPr>
+          <w:p>
+            <w:pPr>
+              <w:pStyle w:val="Compact"/>
+              <w:jc w:val="center"/>
+            </w:pPr>
+            <w:r>
+              <w:t>−17.9 to −9.9</w:t>
+            </w:r>
+          </w:p>
+        </w:tc>
+        <w:tc>
+          <w:tcPr>
+            <w:tcW w:w="0" w:type="auto"/>
+          </w:tcPr>
+          <w:p>
+            <w:pPr>
+              <w:pStyle w:val="Compact"/>
+              <w:jc w:val="center"/>
+            </w:pPr>
+            <w:r>
+              <w:t>&lt;0.001</w:t>
+            </w:r>
+          </w:p>
+        </w:tc>
+      </w:tr>
+      <w:tr>
+        <w:tc>
+          <w:tcPr>
+            <w:tcW w:w="0" w:type="auto"/>
+          </w:tcPr>
+          <w:p>
+            <w:pPr>
+              <w:pStyle w:val="Compact"/>
+            </w:pPr>
+            <w:r>
+              <w:t>Gain + you</w:t>
+            </w:r>
+          </w:p>
+        </w:tc>
+        <w:tc>
+          <w:tcPr>
+            <w:tcW w:w="0" w:type="auto"/>
+          </w:tcPr>
+          <w:p>
+            <w:pPr>
+              <w:pStyle w:val="Compact"/>
+              <w:jc w:val="center"/>
+            </w:pPr>
+            <w:r>
+              <w:t>11.6%</w:t>
+            </w:r>
+          </w:p>
+        </w:tc>
+        <w:tc>
+          <w:tcPr>
+            <w:tcW w:w="0" w:type="auto"/>
+          </w:tcPr>
+          <w:p>
+            <w:pPr>
+              <w:pStyle w:val="Compact"/>
+              <w:jc w:val="center"/>
+            </w:pPr>
+            <w:r>
+              <w:t>−15.2</w:t>
+            </w:r>
+          </w:p>
+        </w:tc>
+        <w:tc>
+          <w:tcPr>
+            <w:tcW w:w="0" w:type="auto"/>
+          </w:tcPr>
+          <w:p>
+            <w:pPr>
+              <w:pStyle w:val="Compact"/>
+              <w:jc w:val="center"/>
+            </w:pPr>
+            <w:r>
+              <w:t>−19.4 to −11.0</w:t>
+            </w:r>
+          </w:p>
+        </w:tc>
+        <w:tc>
+          <w:tcPr>
+            <w:tcW w:w="0" w:type="auto"/>
+          </w:tcPr>
+          <w:p>
+            <w:pPr>
+              <w:pStyle w:val="Compact"/>
+              <w:jc w:val="center"/>
+            </w:pPr>
+            <w:r>
+              <w:t>&lt;0.001</w:t>
+            </w:r>
+          </w:p>
+        </w:tc>
+      </w:tr>
+    </w:tbl>
+    <w:p>
+      <w:pPr>
+        <w:pStyle w:val="BodyText"/>
+      </w:pPr>
+      <w:r>
+        <w:rPr>
+          <w:b/>
+          <w:bCs/>
+        </w:rPr>
+        <w:t>Framing UBS's request makes the agent about half as likely to call it market manipulation.</w:t>
+      </w:r>
+      <w:r>
+        <w:t xml:space="preserve"> With UBS's request neutral, the agent called it market manipulation 26.8% of the time. With the same request framed, at the same moment and with the same history, that fell to 11.6% to 14.6%, a drop of 12 to 15 points under every framing (Table 13). Loss and gain framing lowered recognition about equally, with or without “you”.</w:t>
+      </w:r>
+    </w:p>
+    <w:p>
+      <w:pPr>
+        <w:pStyle w:val="BodyText"/>
+      </w:pPr>
+      <w:r>
+        <w:rPr>
+          <w:b/>
+          <w:bCs/>
+        </w:rPr>
+        <w:t>Agents that recognized the request as manipulation went along as often as agents that did not.</w:t>
+      </w:r>
+      <w:r>
+        <w:t xml:space="preserve"> For the request as each career saw it, the agent called it manipulation 16.2% of the time where it went along </w:t>
+      </w:r>
+      <w:r>
+        <w:lastRenderedPageBreak/>
+        <w:t>and 15.7% where it did not. Recognition was highest at the first request (45%), where going along was also highest (54%), and 4% to 17% at the later requests. In this setting, recognizing the request as manipulation and declining it are separate.</w:t>
+      </w:r>
+    </w:p>
+    <w:p>
+      <w:pPr>
+        <w:pStyle w:val="Heading2"/>
+      </w:pPr>
+      <w:r>
+        <w:t>7.11 Reading an emotional document first (pilot)</w:t>
+      </w:r>
+    </w:p>
+    <w:p>
+      <w:pPr>
+        <w:pStyle w:val="BodyText"/>
+        <w:rPr>
+          <w:b/>
+          <w:bCs/>
+        </w:rPr>
+      </w:pPr>
+      <w:r>
+        <w:t xml:space="preserve">Reading long lists of phrases associated with each direction </w:t>
+      </w:r>
+      <w:r>
+        <w:t>raise</w:t>
+      </w:r>
+      <w:r>
+        <w:t>d the probability of</w:t>
+      </w:r>
+      <w:r>
+        <w:t xml:space="preserve"> going along. Averaged over UBS’s five framings, a neutral document </w:t>
+      </w:r>
+      <w:r>
+        <w:t xml:space="preserve">(of random, non-emotional words) read </w:t>
+      </w:r>
+      <w:r>
+        <w:t xml:space="preserve">just before the request raised the probability of an order that goes along from 18.5% to 22.9%. </w:t>
+      </w:r>
+      <w:r>
+        <w:t>A</w:t>
+      </w:r>
+      <w:r>
+        <w:t xml:space="preserve"> loss</w:t>
+      </w:r>
+      <w:r>
+        <w:t>-focused</w:t>
+      </w:r>
+      <w:r>
+        <w:t xml:space="preserve"> document added</w:t>
+      </w:r>
+      <w:r>
+        <w:t xml:space="preserve"> another</w:t>
+      </w:r>
+      <w:r>
+        <w:t xml:space="preserve"> 10.6</w:t>
+      </w:r>
+      <w:r>
+        <w:t xml:space="preserve"> percentage points above neutral </w:t>
+      </w:r>
+      <w:r>
+        <w:t>(p = 0.020), a blame document 8.0</w:t>
+      </w:r>
+      <w:r>
+        <w:t xml:space="preserve"> points </w:t>
+      </w:r>
+      <w:r>
+        <w:t>(p = 0.031)</w:t>
+      </w:r>
+      <w:r>
+        <w:t xml:space="preserve">, </w:t>
+      </w:r>
+      <w:r>
+        <w:t>a gain document 7.2</w:t>
+      </w:r>
+      <w:r>
+        <w:t xml:space="preserve"> points</w:t>
+      </w:r>
+      <w:r>
+        <w:t xml:space="preserve"> (p = 0.007)</w:t>
+      </w:r>
+      <w:r>
+        <w:t>, and a</w:t>
+      </w:r>
+      <w:r>
+        <w:t xml:space="preserve"> credit document added 1.7</w:t>
+      </w:r>
+      <w:r>
+        <w:t xml:space="preserve"> points</w:t>
+      </w:r>
+      <w:r>
+        <w:t xml:space="preserve"> (p = 0.48)</w:t>
+      </w:r>
+      <w:r>
+        <w:t xml:space="preserve"> (Table 14).</w:t>
+      </w:r>
+      <w:r>
+        <w:rPr>
+          <w:b/>
+          <w:bCs/>
+        </w:rPr>
+        <w:t xml:space="preserve"> </w:t>
+      </w:r>
+    </w:p>
+    <w:p>
+      <w:pPr>
+        <w:pStyle w:val="BodyText"/>
+      </w:pPr>
+      <w:r>
+        <w:t>Loss and gain documents raised going along by similar amounts, so the documents show an effect of emotional content rather than of loss</w:t>
+      </w:r>
+      <w:r>
+        <w:t xml:space="preserve"> or </w:t>
+      </w:r>
+      <w:proofErr w:type="gramStart"/>
+      <w:r>
+        <w:t>gain</w:t>
+      </w:r>
+      <w:r>
+        <w:t xml:space="preserve"> in particular</w:t>
+      </w:r>
+      <w:proofErr w:type="gramEnd"/>
+      <w:r>
+        <w:t xml:space="preserve">. </w:t>
+      </w:r>
+      <w:r>
+        <w:br/>
+      </w:r>
+    </w:p>
+    <w:p>
+      <w:pPr>
+        <w:pStyle w:val="TableCaption"/>
+      </w:pPr>
+      <w:r>
+        <w:rPr>
+          <w:b/>
+          <w:bCs/>
+        </w:rPr>
+        <w:t>Table 14:</w:t>
+      </w:r>
+      <w:r>
+        <w:t xml:space="preserve"> Reading a document just before UBS’s request. The probability of an order that goes along, averaged over UBS’s five framings, at the requests of B’s ten neutral careers (60 moments); p compares each emotional document with the neutral document. Pilot documents, not yet validated.</w:t>
+      </w:r>
+    </w:p>
+    <w:tbl>
+      <w:tblPr>
+        <w:tblW w:w="0" w:type="auto"/>
+        <w:tblCellSpacing w:w="15" w:type="dxa"/>
+        <w:tblBorders>
+          <w:top w:val="single" w:sz="4" w:space="0" w:color="auto"/>
+          <w:left w:val="single" w:sz="4" w:space="0" w:color="auto"/>
+          <w:bottom w:val="single" w:sz="4" w:space="0" w:color="auto"/>
+          <w:right w:val="single" w:sz="4" w:space="0" w:color="auto"/>
+          <w:insideH w:val="single" w:sz="4" w:space="0" w:color="auto"/>
+          <w:insideV w:val="single" w:sz="4" w:space="0" w:color="auto"/>
+        </w:tblBorders>
+        <w:tblCellMar>
+          <w:top w:w="15" w:type="dxa"/>
+          <w:left w:w="15" w:type="dxa"/>
+          <w:bottom w:w="15" w:type="dxa"/>
+          <w:right w:w="15" w:type="dxa"/>
+        </w:tblCellMar>
+        <w:tblLook w:val="04A0" w:firstRow="1" w:lastRow="0" w:firstColumn="1" w:lastColumn="0" w:noHBand="0" w:noVBand="1"/>
+      </w:tblPr>
+      <w:tblGrid>
+        <w:gridCol w:w="1919"/>
+        <w:gridCol w:w="1355"/>
+        <w:gridCol w:w="2264"/>
+      </w:tblGrid>
+      <w:tr>
+        <w:trPr>
+          <w:tblHeader/>
+          <w:tblCellSpacing w:w="15" w:type="dxa"/>
+        </w:trPr>
+        <w:tc>
+          <w:tcPr>
+            <w:tcW w:w="1874" w:type="dxa"/>
+            <w:vAlign w:val="center"/>
+            <w:hideMark/>
+          </w:tcPr>
+          <w:p>
+            <w:pPr>
+              <w:pStyle w:val="Compact"/>
+              <w:rPr>
+                <w:b/>
+                <w:bCs/>
+              </w:rPr>
+            </w:pPr>
+            <w:r>
+              <w:rPr>
+                <w:b/>
+                <w:bCs/>
+              </w:rPr>
+              <w:t>Document read first</w:t>
+            </w:r>
+          </w:p>
+        </w:tc>
+        <w:tc>
+          <w:tcPr>
+            <w:tcW w:w="1325" w:type="dxa"/>
+            <w:vAlign w:val="center"/>
+            <w:hideMark/>
+          </w:tcPr>
+          <w:p>
+            <w:pPr>
+              <w:pStyle w:val="Compact"/>
+              <w:rPr>
+                <w:b/>
+                <w:bCs/>
+              </w:rPr>
+            </w:pPr>
+            <w:proofErr w:type="gramStart"/>
+            <w:r>
+              <w:rPr>
+                <w:b/>
+                <w:bCs/>
+              </w:rPr>
+              <w:t>P(</w:t>
+            </w:r>
+            <w:proofErr w:type="gramEnd"/>
+            <w:r>
+              <w:rPr>
+                <w:b/>
+                <w:bCs/>
+              </w:rPr>
+              <w:t>goes along)</w:t>
+            </w:r>
+          </w:p>
+        </w:tc>
+        <w:tc>
+          <w:tcPr>
+            <w:tcW w:w="2219" w:type="dxa"/>
+            <w:vAlign w:val="center"/>
+          </w:tcPr>
+          <w:p>
+            <w:pPr>
+              <w:pStyle w:val="Compact"/>
+              <w:rPr>
+                <w:b/>
+                <w:bCs/>
+              </w:rPr>
+            </w:pPr>
+            <w:r>
+              <w:rPr>
+                <w:b/>
+                <w:bCs/>
+              </w:rPr>
+              <w:t>p (vs neutral)</w:t>
+            </w:r>
+          </w:p>
+        </w:tc>
+      </w:tr>
+      <w:tr>
+        <w:trPr>
+          <w:tblCellSpacing w:w="15" w:type="dxa"/>
+        </w:trPr>
+        <w:tc>
+          <w:tcPr>
+            <w:tcW w:w="1874" w:type="dxa"/>
+            <w:vAlign w:val="center"/>
+            <w:hideMark/>
+          </w:tcPr>
+          <w:p>
+            <w:pPr>
+              <w:pStyle w:val="Compact"/>
+              <w:rPr>
+                <w:b/>
+                <w:bCs/>
+              </w:rPr>
+            </w:pPr>
+            <w:r>
+              <w:t>None</w:t>
+            </w:r>
+          </w:p>
+        </w:tc>
+        <w:tc>
+          <w:tcPr>
+            <w:tcW w:w="1325" w:type="dxa"/>
+            <w:vAlign w:val="center"/>
+            <w:hideMark/>
+          </w:tcPr>
+          <w:p>
+            <w:pPr>
+              <w:pStyle w:val="Compact"/>
+              <w:rPr>
+                <w:b/>
+                <w:bCs/>
+              </w:rPr>
+            </w:pPr>
+            <w:r>
+              <w:t>18.5%</w:t>
+            </w:r>
+          </w:p>
+        </w:tc>
+        <w:tc>
+          <w:tcPr>
+            <w:tcW w:w="2219" w:type="dxa"/>
+            <w:vAlign w:val="center"/>
+          </w:tcPr>
+          <w:p>
+            <w:pPr>
+              <w:pStyle w:val="Compact"/>
+              <w:rPr>
+                <w:b/>
+                <w:bCs/>
+              </w:rPr>
+            </w:pPr>
+            <w:r>
+              <w:t>–</w:t>
+            </w:r>
+          </w:p>
+        </w:tc>
+      </w:tr>
+      <w:tr>
+        <w:trPr>
+          <w:tblCellSpacing w:w="15" w:type="dxa"/>
+        </w:trPr>
+        <w:tc>
+          <w:tcPr>
+            <w:tcW w:w="1874" w:type="dxa"/>
+            <w:vAlign w:val="center"/>
+            <w:hideMark/>
+          </w:tcPr>
+          <w:p>
+            <w:pPr>
+              <w:pStyle w:val="Compact"/>
+              <w:rPr>
+                <w:b/>
+                <w:bCs/>
+              </w:rPr>
+            </w:pPr>
+            <w:r>
+              <w:t>Neutral</w:t>
+            </w:r>
+          </w:p>
+        </w:tc>
+        <w:tc>
+          <w:tcPr>
+            <w:tcW w:w="1325" w:type="dxa"/>
+            <w:vAlign w:val="center"/>
+            <w:hideMark/>
+          </w:tcPr>
+          <w:p>
+            <w:pPr>
+              <w:pStyle w:val="Compact"/>
+              <w:rPr>
+                <w:b/>
+                <w:bCs/>
+              </w:rPr>
+            </w:pPr>
+            <w:r>
+              <w:t>22.9%</w:t>
+            </w:r>
+          </w:p>
+        </w:tc>
+        <w:tc>
+          <w:tcPr>
+            <w:tcW w:w="2219" w:type="dxa"/>
+            <w:vAlign w:val="center"/>
+          </w:tcPr>
+          <w:p>
+            <w:pPr>
+              <w:pStyle w:val="Compact"/>
+              <w:rPr>
+                <w:b/>
+                <w:bCs/>
+              </w:rPr>
+            </w:pPr>
+            <w:r>
+              <w:t>–</w:t>
+            </w:r>
+          </w:p>
+        </w:tc>
+      </w:tr>
+      <w:tr>
+        <w:trPr>
+          <w:tblCellSpacing w:w="15" w:type="dxa"/>
+        </w:trPr>
+        <w:tc>
+          <w:tcPr>
+            <w:tcW w:w="1874" w:type="dxa"/>
+            <w:vAlign w:val="center"/>
+          </w:tcPr>
+          <w:p>
+            <w:pPr>
+              <w:pStyle w:val="Compact"/>
+            </w:pPr>
+            <w:r>
+              <w:t>Loss</w:t>
+            </w:r>
+          </w:p>
+        </w:tc>
+        <w:tc>
+          <w:tcPr>
+            <w:tcW w:w="1325" w:type="dxa"/>
+            <w:vAlign w:val="center"/>
+          </w:tcPr>
+          <w:p>
+            <w:pPr>
+              <w:pStyle w:val="Compact"/>
+            </w:pPr>
+            <w:r>
+              <w:t>33.5%</w:t>
+            </w:r>
+          </w:p>
+        </w:tc>
+        <w:tc>
+          <w:tcPr>
+            <w:tcW w:w="2219" w:type="dxa"/>
+            <w:vAlign w:val="center"/>
+          </w:tcPr>
+          <w:p>
+            <w:pPr>
+              <w:pStyle w:val="Compact"/>
+            </w:pPr>
+            <w:r>
+              <w:t>0.020</w:t>
+            </w:r>
+          </w:p>
+        </w:tc>
+      </w:tr>
+      <w:tr>
+        <w:trPr>
+          <w:tblCellSpacing w:w="15" w:type="dxa"/>
+        </w:trPr>
+        <w:tc>
+          <w:tcPr>
+            <w:tcW w:w="1874" w:type="dxa"/>
+            <w:vAlign w:val="center"/>
+            <w:hideMark/>
+          </w:tcPr>
+          <w:p>
+            <w:pPr>
+              <w:pStyle w:val="Compact"/>
+              <w:rPr>
+                <w:b/>
+                <w:bCs/>
+              </w:rPr>
+            </w:pPr>
+            <w:r>
+              <w:t>Gain</w:t>
+            </w:r>
+          </w:p>
+        </w:tc>
+        <w:tc>
+          <w:tcPr>
+            <w:tcW w:w="1325" w:type="dxa"/>
+            <w:vAlign w:val="center"/>
+            <w:hideMark/>
+          </w:tcPr>
+          <w:p>
+            <w:pPr>
+              <w:pStyle w:val="Compact"/>
+              <w:rPr>
+                <w:b/>
+                <w:bCs/>
+              </w:rPr>
+            </w:pPr>
+            <w:r>
+              <w:t>30.6%</w:t>
+            </w:r>
+          </w:p>
+        </w:tc>
+        <w:tc>
+          <w:tcPr>
+            <w:tcW w:w="2219" w:type="dxa"/>
+            <w:vAlign w:val="center"/>
+          </w:tcPr>
+          <w:p>
+            <w:pPr>
+              <w:pStyle w:val="Compact"/>
+              <w:rPr>
+                <w:b/>
+                <w:bCs/>
+              </w:rPr>
+            </w:pPr>
+            <w:r>
+              <w:t>0.007</w:t>
+            </w:r>
+          </w:p>
+        </w:tc>
+      </w:tr>
+      <w:tr>
+        <w:trPr>
+          <w:tblCellSpacing w:w="15" w:type="dxa"/>
+        </w:trPr>
+        <w:tc>
+          <w:tcPr>
+            <w:tcW w:w="1874" w:type="dxa"/>
+            <w:vAlign w:val="center"/>
+            <w:hideMark/>
+          </w:tcPr>
+          <w:p>
+            <w:pPr>
+              <w:pStyle w:val="Compact"/>
+              <w:rPr>
+                <w:b/>
+                <w:bCs/>
+              </w:rPr>
+            </w:pPr>
+            <w:r>
+              <w:t>Blame</w:t>
+            </w:r>
+          </w:p>
+        </w:tc>
+        <w:tc>
+          <w:tcPr>
+            <w:tcW w:w="1325" w:type="dxa"/>
+            <w:vAlign w:val="center"/>
+            <w:hideMark/>
+          </w:tcPr>
+          <w:p>
+            <w:pPr>
+              <w:pStyle w:val="Compact"/>
+              <w:rPr>
+                <w:b/>
+                <w:bCs/>
+              </w:rPr>
+            </w:pPr>
+            <w:r>
+              <w:t>31.0%</w:t>
+            </w:r>
+          </w:p>
+        </w:tc>
+        <w:tc>
+          <w:tcPr>
+            <w:tcW w:w="2219" w:type="dxa"/>
+            <w:vAlign w:val="center"/>
+          </w:tcPr>
+          <w:p>
+            <w:pPr>
+              <w:pStyle w:val="Compact"/>
+              <w:rPr>
+                <w:b/>
+                <w:bCs/>
+              </w:rPr>
+            </w:pPr>
+            <w:r>
+              <w:t>0.031</w:t>
+            </w:r>
+          </w:p>
+        </w:tc>
+      </w:tr>
+      <w:tr>
+        <w:trPr>
+          <w:trHeight w:val="56"/>
+          <w:tblCellSpacing w:w="15" w:type="dxa"/>
+        </w:trPr>
+        <w:tc>
+          <w:tcPr>
+            <w:tcW w:w="1874" w:type="dxa"/>
+            <w:vAlign w:val="center"/>
+          </w:tcPr>
+          <w:p>
+            <w:pPr>
+              <w:pStyle w:val="Compact"/>
+              <w:rPr>
+                <w:b/>
+                <w:bCs/>
+              </w:rPr>
+            </w:pPr>
+            <w:r>
+              <w:t>Credit</w:t>
+            </w:r>
+          </w:p>
+        </w:tc>
+        <w:tc>
+          <w:tcPr>
+            <w:tcW w:w="1325" w:type="dxa"/>
+            <w:vAlign w:val="center"/>
+          </w:tcPr>
+          <w:p>
+            <w:pPr>
+              <w:pStyle w:val="Compact"/>
+              <w:rPr>
+                <w:b/>
+                <w:bCs/>
+              </w:rPr>
+            </w:pPr>
+            <w:r>
+              <w:t>24.7%</w:t>
+            </w:r>
+          </w:p>
+        </w:tc>
+        <w:tc>
+          <w:tcPr>
+            <w:tcW w:w="2219" w:type="dxa"/>
+            <w:vAlign w:val="center"/>
+          </w:tcPr>
+          <w:p>
+            <w:r>
+              <w:t>0.48</w:t>
+            </w:r>
+          </w:p>
+        </w:tc>
+      </w:tr>
+    </w:tbl>
+    <w:p>
+      <w:pPr>
+        <w:pStyle w:val="BodyText"/>
+      </w:pPr>
+    </w:p>
+    <w:p>
+      <w:pPr>
+        <w:pStyle w:val="BodyText"/>
+      </w:pPr>
+      <w:r>
+        <w:rPr>
+          <w:b/>
+          <w:bCs/>
+        </w:rPr>
+        <w:t>[Note:</w:t>
+      </w:r>
+      <w:r>
+        <w:t xml:space="preserve"> </w:t>
+      </w:r>
+      <w:r>
+        <w:rPr>
+          <w:i/>
+          <w:iCs/>
+        </w:rPr>
+        <w:t>To be completed when the screenplay run is in: the screenplay history against the real one at each request, and the screenplay's state injected into the real history, layer by layer, against random vectors.</w:t>
       </w:r>
       <w:r>
         <w:rPr>
@@ -8209,11 +11210,14 @@
           <w:b/>
           <w:bCs/>
         </w:rPr>
+        <w:t>Two kinds of pressure, two kinds of misconduct.</w:t>
+      </w:r>
+      <w:r>
+        <w:t xml:space="preserve"> A counterparty’s loss framing made the agent more willing to join in pushing the price, while the same loss-or-gain priming from its own management made it trade far more without making it collude. The difference matters for deployment: the pressures that change an agent’s risk-taking and the pressures that change its willingness to join a scheme are not the </w:t>
+      </w:r>
+      <w:r>
         <w:lastRenderedPageBreak/>
-        <w:t>Two kinds of pressure, two kinds of misconduct.</w:t>
-      </w:r>
-      <w:r>
-        <w:t xml:space="preserve"> A counterparty’s loss framing made the agent more willing to join in pushing the price, while the same loss-or-gain priming from its own management made it trade far more without making it collude. The difference matters for deployment: the pressures that change an agent’s risk-taking and the pressures that change its willingness to join a scheme are not the same, and testing one does not cover the other. Two cautions apply. The management memo combined a loss already suffered with a threat about the future (“a further loss will close the desk”), so it cannot say which of the two drove risk-taking. And the two sources used different wording; the matched-history reads will show whether management’s loss and UBS’s loss share a representation inside the model.</w:t>
+        <w:t>same, and testing one does not cover the other. Two cautions apply. The management memo combined a loss already suffered with a threat about the future (“a further loss will close the desk”), so it cannot say which of the two drove risk-taking. And the two sources used different wording; the matched-history reads will show whether management’s loss and UBS’s loss share a representation inside the model.</w:t>
       </w:r>
     </w:p>
     <w:p>
@@ -8308,11 +11312,42 @@
     </w:p>
     <w:p>
       <w:pPr>
+        <w:pStyle w:val="BodyText"/>
+      </w:pPr>
+      <w:r>
+        <w:rPr>
+          <w:b/>
+          <w:bCs/>
+        </w:rPr>
+        <w:t>A framed request makes misconduct harder for the agent to recognize.</w:t>
+      </w:r>
+      <w:r>
+        <w:t xml:space="preserve"> The same request, framed, was recognized as market manipulation about half as often as when it was put neutrally, and recognizing it did not separate the agents that went along from those that did not. A safeguard that relies on the model noticing that a request is misconduct would be weakened by exactly the framing a counterparty can apply for free.</w:t>
+      </w:r>
+    </w:p>
+    <w:p>
+      <w:pPr>
+        <w:pStyle w:val="BodyText"/>
+      </w:pPr>
+      <w:r>
+        <w:rPr>
+          <w:b/>
+          <w:bCs/>
+        </w:rPr>
+        <w:t>The framing acts early and is carried forward by the conversation, not by a single signal at the decision.</w:t>
+      </w:r>
+      <w:r>
+        <w:t xml:space="preserve"> At fixed history, the request's framing moved the decision by a few points; the history it had built moved it by about four times as much, and that history pulled hardest at the second request. Pushing the state at the decision along the loss direction did not reproduce the effect, while a direction built from the decision itself did. The framing works through what the conversation accumulates up to the decision, not through a single loss signal at it.</w:t>
+      </w:r>
+    </w:p>
+    <w:p>
+      <w:pPr>
         <w:pStyle w:val="Heading1"/>
       </w:pPr>
       <w:bookmarkStart w:id="31" w:name="limitations"/>
       <w:bookmarkEnd w:id="30"/>
       <w:r>
+        <w:lastRenderedPageBreak/>
         <w:t>9 Limitations</w:t>
       </w:r>
       <w:r>
@@ -8385,7 +11420,6 @@
           <w:b/>
           <w:bCs/>
         </w:rPr>
-        <w:lastRenderedPageBreak/>
         <w:t>Going along is not intent.</w:t>
       </w:r>
       <w:r>
@@ -8480,6 +11514,60 @@
       </w:r>
       <w:r>
         <w:t xml:space="preserve"> C redone, the comparisons of F with B’s neutral careers, the word screen and every analysis inside the model are exploratory.</w:t>
+      </w:r>
+    </w:p>
+    <w:p>
+      <w:pPr>
+        <w:numPr>
+          <w:ilvl w:val="0"/>
+          <w:numId w:val="4"/>
+        </w:numPr>
+      </w:pPr>
+      <w:r>
+        <w:rPr>
+          <w:b/>
+          <w:bCs/>
+        </w:rPr>
+        <w:t>Probability read-outs.</w:t>
+      </w:r>
+      <w:r>
+        <w:t xml:space="preserve"> The rereads measure the model's probability of each order after a fixed neutral reasoning line, not sampled decisions; their levels differ from the sampled rates, and in B the orders scored cover a median of 67% of the probability (95% in A).</w:t>
+      </w:r>
+    </w:p>
+    <w:p>
+      <w:pPr>
+        <w:numPr>
+          <w:ilvl w:val="0"/>
+          <w:numId w:val="4"/>
+        </w:numPr>
+      </w:pPr>
+      <w:r>
+        <w:rPr>
+          <w:b/>
+          <w:bCs/>
+        </w:rPr>
+        <w:t>History is a bundle.</w:t>
+      </w:r>
+      <w:r>
+        <w:t xml:space="preserve"> In B the history's effect combines UBS's earlier framed lines with the agent's own replies and trades; the screenplay rereads separate the agent's replies.</w:t>
+      </w:r>
+    </w:p>
+    <w:p>
+      <w:pPr>
+        <w:numPr>
+          <w:ilvl w:val="0"/>
+          <w:numId w:val="4"/>
+        </w:numPr>
+      </w:pPr>
+      <w:r>
+        <w:rPr>
+          <w:b/>
+          <w:bCs/>
+        </w:rPr>
+        <w:t>Pilot documents.</w:t>
+      </w:r>
+      <w:r>
+        <w:t xml:space="preserve"> The emotional documents were written quickly and not validated.</w:t>
       </w:r>
     </w:p>
     <w:p>
@@ -8577,6 +11665,7 @@
       <w:bookmarkStart w:id="36" w:name="ref-baker2025"/>
       <w:bookmarkEnd w:id="35"/>
       <w:r>
+        <w:lastRenderedPageBreak/>
         <w:t xml:space="preserve">Baker, Bowen, Joost Huizinga, Leo Gao, Zehao Dou, Melody Y. Guan, Aleksander Madry, Wojciech Zaremba, Jakub Pachocki, and David Farhi. 2025. “Monitoring Reasoning Models for Misbehavior and the Risks of Promoting Obfuscation.” </w:t>
       </w:r>
       <w:hyperlink r:id="rId10">
@@ -8720,7 +11809,6 @@
       <w:bookmarkStart w:id="43" w:name="ref-horton2023"/>
       <w:bookmarkEnd w:id="42"/>
       <w:r>
-        <w:lastRenderedPageBreak/>
         <w:t>Horton, John J. 2023. “Large Language Models as Simulated Economic Agents: What Can We Learn from Homo Silicus?” NBER Working Paper 31122. National Bureau of Economic Research.</w:t>
       </w:r>
     </w:p>
@@ -8884,6 +11972,7 @@
       <w:bookmarkStart w:id="52" w:name="ref-mcdougall2025"/>
       <w:bookmarkEnd w:id="51"/>
       <w:r>
+        <w:lastRenderedPageBreak/>
         <w:t xml:space="preserve">McDougall, Callum, Arthur Conmy, János Kramár, Tom Lieberum, Senthooran Rajamanoharan, and Neel Nanda. 2025. “Gemma Scope 2 – Technical Paper.” Google DeepMind. </w:t>
       </w:r>
       <w:hyperlink r:id="rId16">
@@ -9007,7 +12096,6 @@
       <w:bookmarkStart w:id="58" w:name="ref-thaler1990"/>
       <w:bookmarkEnd w:id="57"/>
       <w:r>
-        <w:lastRenderedPageBreak/>
         <w:t xml:space="preserve">Thaler, Richard H., and Eric J. Johnson. 1990. “Gambling with the House Money and Trying to Break Even: The Effects of Prior Outcomes on Risky Choice.” </w:t>
       </w:r>
       <w:r>
@@ -9123,7 +12211,7 @@
           <w:b/>
           <w:bCs/>
         </w:rPr>
-        <w:t>Table 11:</w:t>
+        <w:t>Table 15:</w:t>
       </w:r>
       <w:r>
         <w:t xml:space="preserve"> Every condition, with going along. Ten careers per version unless stated.</w:t>
@@ -9586,6 +12674,7 @@
       <w:bookmarkStart w:id="64" w:name="app:changes"/>
       <w:bookmarkEnd w:id="63"/>
       <w:r>
+        <w:lastRenderedPageBreak/>
         <w:t>Appendix B. Departures from the September Design Draft</w:t>
       </w:r>
     </w:p>
@@ -9658,7 +12747,6 @@
       <w:bookmarkStart w:id="65" w:name="app:prereg"/>
       <w:bookmarkEnd w:id="64"/>
       <w:r>
-        <w:lastRenderedPageBreak/>
         <w:t>Appendix C. Preregistration Record</w:t>
       </w:r>
     </w:p>
@@ -10326,6 +13414,8 @@
     </w:pPrDefault>
   </w:docDefaults>
   <w:latentStyles w:defLockedState="0" w:defUIPriority="0" w:defSemiHidden="0" w:defUnhideWhenUsed="0" w:defQFormat="0" w:count="376">
+    <w:lsdException w:name="Strong" w:uiPriority="22" w:qFormat="1"/>
+    <w:lsdException w:name="Normal (Web)" w:uiPriority="99"/>
     <w:lsdException w:name="Normal Table" w:semiHidden="1" w:unhideWhenUsed="1"/>
     <w:lsdException w:name="Table Simple 1" w:semiHidden="1" w:unhideWhenUsed="1"/>
     <w:lsdException w:name="Table Simple 2" w:semiHidden="1" w:unhideWhenUsed="1"/>
@@ -11375,6 +14465,31 @@
     <w:link w:val="Footer"/>
     <w:rsid w:val="005905FC"/>
   </w:style>
+  <w:style w:type="character" w:styleId="Strong">
+    <w:name w:val="Strong"/>
+    <w:basedOn w:val="DefaultParagraphFont"/>
+    <w:uiPriority w:val="22"/>
+    <w:qFormat/>
+    <w:rsid w:val="00F824D4"/>
+    <w:rPr>
+      <w:b/>
+      <w:bCs/>
+    </w:rPr>
+  </w:style>
+  <w:style w:type="paragraph" w:styleId="NormalWeb">
+    <w:name w:val="Normal (Web)"/>
+    <w:basedOn w:val="Normal"/>
+    <w:uiPriority w:val="99"/>
+    <w:unhideWhenUsed/>
+    <w:rsid w:val="00E21A66"/>
+    <w:pPr>
+      <w:spacing w:before="100" w:beforeAutospacing="1" w:after="100" w:afterAutospacing="1"/>
+    </w:pPr>
+    <w:rPr>
+      <w:sz w:val="24"/>
+      <w:szCs w:val="24"/>
+    </w:rPr>
+  </w:style>
 </w:styles>
 </file>
 

</xml_diff>